<commit_message>
feat(hsk): complete HSK2 and refine shared HSK1-HSK2 learning UI
</commit_message>
<xml_diff>
--- a/Sửa new.docx
+++ b/Sửa new.docx
@@ -46,6 +46,9 @@
     </w:p>
     <w:p>
       <w:r>
+        <w:rPr>
+          <w:noProof/>
+        </w:rPr>
         <mc:AlternateContent>
           <mc:Choice Requires="wps">
             <w:drawing>
@@ -214,6 +217,9 @@
     </w:p>
     <w:p>
       <w:r>
+        <w:rPr>
+          <w:noProof/>
+        </w:rPr>
         <mc:AlternateContent>
           <mc:Choice Requires="wps">
             <w:drawing>
@@ -410,6 +416,9 @@
     </w:p>
     <w:p>
       <w:r>
+        <w:rPr>
+          <w:noProof/>
+        </w:rPr>
         <mc:AlternateContent>
           <mc:Choice Requires="wps">
             <w:drawing>
@@ -523,6 +532,9 @@
     </w:p>
     <w:p>
       <w:r>
+        <w:rPr>
+          <w:noProof/>
+        </w:rPr>
         <mc:AlternateContent>
           <mc:Choice Requires="wps">
             <w:drawing>
@@ -613,30 +625,14 @@
           <w:b/>
           <w:bCs/>
         </w:rPr>
-        <w:t xml:space="preserve">Để mô tả là được </w:t>
-      </w:r>
-      <w:proofErr w:type="gramStart"/>
-      <w:r>
-        <w:rPr>
-          <w:b/>
-          <w:bCs/>
-        </w:rPr>
-        <w:t xml:space="preserve">rồi </w:t>
-      </w:r>
-      <w:r>
-        <w:rPr>
-          <w:b/>
-          <w:bCs/>
-        </w:rPr>
-        <w:t xml:space="preserve"> xóa</w:t>
-      </w:r>
-      <w:proofErr w:type="gramEnd"/>
-      <w:r>
-        <w:rPr>
-          <w:b/>
-          <w:bCs/>
-        </w:rPr>
-        <w:t xml:space="preserve"> hình đi</w:t>
+        <w:t xml:space="preserve">Để mô tả là được rồi </w:t>
+      </w:r>
+      <w:r>
+        <w:rPr>
+          <w:b/>
+          <w:bCs/>
+        </w:rPr>
+        <w:t xml:space="preserve"> xóa hình đi</w:t>
       </w:r>
     </w:p>
     <w:p>
@@ -830,6 +826,9 @@
     </w:p>
     <w:p>
       <w:r>
+        <w:rPr>
+          <w:noProof/>
+        </w:rPr>
         <mc:AlternateContent>
           <mc:Choice Requires="wps">
             <w:drawing>
@@ -908,6 +907,9 @@
         <w:t>Hình khởi động</w:t>
       </w:r>
       <w:r>
+        <w:rPr>
+          <w:noProof/>
+        </w:rPr>
         <mc:AlternateContent>
           <mc:Choice Requires="wps">
             <w:drawing>
@@ -1131,6 +1133,9 @@
     <w:p/>
     <w:p>
       <w:r>
+        <w:rPr>
+          <w:noProof/>
+        </w:rPr>
         <w:lastRenderedPageBreak/>
         <w:drawing>
           <wp:anchor distT="0" distB="0" distL="114300" distR="114300" simplePos="0" relativeHeight="251663360" behindDoc="0" locked="0" layoutInCell="1" allowOverlap="1" wp14:anchorId="2B2F5892" wp14:editId="3234FE91">
@@ -1274,6 +1279,9 @@
     </w:p>
     <w:p>
       <w:r>
+        <w:rPr>
+          <w:noProof/>
+        </w:rPr>
         <w:drawing>
           <wp:anchor distT="0" distB="0" distL="114300" distR="114300" simplePos="0" relativeHeight="251664384" behindDoc="0" locked="0" layoutInCell="1" allowOverlap="1" wp14:anchorId="5D1A6867" wp14:editId="25CFD3DB">
             <wp:simplePos x="0" y="0"/>
@@ -1331,6 +1339,9 @@
     <w:p/>
     <w:p>
       <w:r>
+        <w:rPr>
+          <w:noProof/>
+        </w:rPr>
         <w:lastRenderedPageBreak/>
         <w:drawing>
           <wp:anchor distT="0" distB="0" distL="114300" distR="114300" simplePos="0" relativeHeight="251665408" behindDoc="0" locked="0" layoutInCell="1" allowOverlap="1" wp14:anchorId="4BEDB8FD" wp14:editId="36E9AE21">
@@ -1429,6 +1440,9 @@
     </w:p>
     <w:p>
       <w:r>
+        <w:rPr>
+          <w:noProof/>
+        </w:rPr>
         <mc:AlternateContent>
           <mc:Choice Requires="wps">
             <w:drawing>
@@ -1524,6 +1538,9 @@
     </w:p>
     <w:p>
       <w:r>
+        <w:rPr>
+          <w:noProof/>
+        </w:rPr>
         <mc:AlternateContent>
           <mc:Choice Requires="wps">
             <w:drawing>
@@ -1701,6 +1718,9 @@
     </w:p>
     <w:p>
       <w:r>
+        <w:rPr>
+          <w:noProof/>
+        </w:rPr>
         <mc:AlternateContent>
           <mc:Choice Requires="wps">
             <w:drawing>
@@ -1779,6 +1799,9 @@
         <w:t>Hình gợi ý hoạt động trên lớp</w:t>
       </w:r>
       <w:r>
+        <w:rPr>
+          <w:noProof/>
+        </w:rPr>
         <mc:AlternateContent>
           <mc:Choice Requires="wps">
             <w:drawing>
@@ -1877,6 +1900,9 @@
     </w:p>
     <w:p>
       <w:r>
+        <w:rPr>
+          <w:noProof/>
+        </w:rPr>
         <mc:AlternateContent>
           <mc:Choice Requires="wps">
             <w:drawing>
@@ -2058,6 +2084,9 @@
     </w:p>
     <w:p>
       <w:r>
+        <w:rPr>
+          <w:noProof/>
+        </w:rPr>
         <mc:AlternateContent>
           <mc:Choice Requires="wps">
             <w:drawing>
@@ -2386,15 +2415,7 @@
       </w:r>
       <w:r>
         <w:br/>
-        <w:t xml:space="preserve">Chúng tôi đến Nhà hàng Tây </w:t>
-      </w:r>
-      <w:proofErr w:type="gramStart"/>
-      <w:r>
-        <w:t>An</w:t>
-      </w:r>
-      <w:proofErr w:type="gramEnd"/>
-      <w:r>
-        <w:t xml:space="preserve"> ăn tối.</w:t>
+        <w:t>Chúng tôi đến Nhà hàng Tây An ăn tối.</w:t>
       </w:r>
     </w:p>
     <w:p>
@@ -2637,6 +2658,9 @@
     </w:p>
     <w:p>
       <w:r>
+        <w:rPr>
+          <w:noProof/>
+        </w:rPr>
         <mc:AlternateContent>
           <mc:Choice Requires="wps">
             <w:drawing>
@@ -2715,6 +2739,9 @@
         <w:t>Hình tổng kết học tập</w:t>
       </w:r>
       <w:r>
+        <w:rPr>
+          <w:noProof/>
+        </w:rPr>
         <mc:AlternateContent>
           <mc:Choice Requires="wps">
             <w:drawing>
@@ -2810,6 +2837,9 @@
     </w:p>
     <w:p>
       <w:r>
+        <w:rPr>
+          <w:noProof/>
+        </w:rPr>
         <mc:AlternateContent>
           <mc:Choice Requires="wps">
             <w:drawing>
@@ -2888,6 +2918,9 @@
         <w:t>Hình tổng kết học tập</w:t>
       </w:r>
       <w:r>
+        <w:rPr>
+          <w:noProof/>
+        </w:rPr>
         <mc:AlternateContent>
           <mc:Choice Requires="wps">
             <w:drawing>
@@ -5007,7 +5040,2109 @@
         <w:t> - Hôm nay chúng tôi vui quá!</w:t>
       </w:r>
     </w:p>
+    <w:p>
+      <w:pPr>
+        <w:rPr>
+          <w:b/>
+          <w:bCs/>
+        </w:rPr>
+      </w:pPr>
+      <w:r>
+        <w:rPr>
+          <w:b/>
+          <w:bCs/>
+        </w:rPr>
+        <w:br w:type="page"/>
+      </w:r>
+    </w:p>
+    <w:p>
+      <w:pPr>
+        <w:ind w:left="720"/>
+      </w:pPr>
+      <w:r>
+        <w:lastRenderedPageBreak/>
+        <w:t>HSK 2</w:t>
+      </w:r>
+    </w:p>
+    <w:p>
+      <w:pPr>
+        <w:ind w:left="720"/>
+      </w:pPr>
+      <w:r>
+        <w:t xml:space="preserve">ở </w:t>
+      </w:r>
+    </w:p>
+    <w:p>
+      <w:pPr>
+        <w:ind w:left="720"/>
+      </w:pPr>
+      <w:r>
+        <w:rPr>
+          <w:b/>
+          <w:bCs/>
+        </w:rPr>
+        <w:t>Nhiệm vụ theo đúng sách</w:t>
+      </w:r>
+      <w:r>
+        <w:t>Giữ nguyên câu hỏi, lựa chọn và thứ tự nguồn</w:t>
+      </w:r>
+    </w:p>
+    <w:p>
+      <w:pPr>
+        <w:ind w:left="720"/>
+        <w:rPr>
+          <w:b/>
+          <w:bCs/>
+        </w:rPr>
+      </w:pPr>
+      <w:r>
+        <w:rPr>
+          <w:b/>
+          <w:bCs/>
+        </w:rPr>
+        <w:t>Nghe và chọn đáp án</w:t>
+      </w:r>
+    </w:p>
+    <w:p>
+      <w:pPr>
+        <w:ind w:left="720"/>
+      </w:pPr>
+      <w:r>
+        <w:t>Audio: 1-1.</w:t>
+      </w:r>
+    </w:p>
+    <w:p>
+      <w:pPr>
+        <w:numPr>
+          <w:ilvl w:val="0"/>
+          <w:numId w:val="12"/>
+        </w:numPr>
+      </w:pPr>
+      <w:r>
+        <w:t>谁来接白家月了？</w:t>
+      </w:r>
+      <w:r>
+        <w:t xml:space="preserve"> — </w:t>
+      </w:r>
+      <w:r>
+        <w:rPr>
+          <w:b/>
+          <w:bCs/>
+        </w:rPr>
+        <w:t xml:space="preserve">A. </w:t>
+      </w:r>
+      <w:r>
+        <w:rPr>
+          <w:b/>
+          <w:bCs/>
+        </w:rPr>
+        <w:t>王一飞</w:t>
+      </w:r>
+      <w:r>
+        <w:rPr>
+          <w:b/>
+          <w:bCs/>
+        </w:rPr>
+        <w:t xml:space="preserve"> · B. </w:t>
+      </w:r>
+      <w:r>
+        <w:rPr>
+          <w:b/>
+          <w:bCs/>
+        </w:rPr>
+        <w:t>王一雪</w:t>
+      </w:r>
+      <w:r>
+        <w:rPr>
+          <w:b/>
+          <w:bCs/>
+        </w:rPr>
+        <w:t xml:space="preserve"> · C. </w:t>
+      </w:r>
+      <w:r>
+        <w:rPr>
+          <w:b/>
+          <w:bCs/>
+        </w:rPr>
+        <w:t>她的姐姐</w:t>
+      </w:r>
+    </w:p>
+    <w:p>
+      <w:pPr>
+        <w:numPr>
+          <w:ilvl w:val="0"/>
+          <w:numId w:val="13"/>
+        </w:numPr>
+      </w:pPr>
+      <w:r>
+        <w:t>王一飞给谁打电话了？</w:t>
+      </w:r>
+      <w:r>
+        <w:t xml:space="preserve"> — </w:t>
+      </w:r>
+      <w:r>
+        <w:rPr>
+          <w:b/>
+          <w:bCs/>
+        </w:rPr>
+        <w:t xml:space="preserve">A. </w:t>
+      </w:r>
+      <w:r>
+        <w:rPr>
+          <w:b/>
+          <w:bCs/>
+        </w:rPr>
+        <w:t>安妮</w:t>
+      </w:r>
+      <w:r>
+        <w:rPr>
+          <w:b/>
+          <w:bCs/>
+        </w:rPr>
+        <w:t xml:space="preserve"> · B. </w:t>
+      </w:r>
+      <w:r>
+        <w:rPr>
+          <w:b/>
+          <w:bCs/>
+        </w:rPr>
+        <w:t>白家月</w:t>
+      </w:r>
+      <w:r>
+        <w:rPr>
+          <w:b/>
+          <w:bCs/>
+        </w:rPr>
+        <w:t xml:space="preserve"> · C. </w:t>
+      </w:r>
+      <w:r>
+        <w:rPr>
+          <w:b/>
+          <w:bCs/>
+        </w:rPr>
+        <w:t>王一雪</w:t>
+      </w:r>
+    </w:p>
+    <w:p>
+      <w:pPr>
+        <w:ind w:left="720"/>
+        <w:rPr>
+          <w:b/>
+          <w:bCs/>
+        </w:rPr>
+      </w:pPr>
+      <w:r>
+        <w:rPr>
+          <w:b/>
+          <w:bCs/>
+        </w:rPr>
+        <w:t>Câu hỏi sau bài khóa</w:t>
+      </w:r>
+    </w:p>
+    <w:p>
+      <w:pPr>
+        <w:numPr>
+          <w:ilvl w:val="0"/>
+          <w:numId w:val="14"/>
+        </w:numPr>
+      </w:pPr>
+      <w:r>
+        <w:t>来北京前，白家月认识王一雪吗？</w:t>
+      </w:r>
+    </w:p>
+    <w:p>
+      <w:pPr>
+        <w:numPr>
+          <w:ilvl w:val="0"/>
+          <w:numId w:val="15"/>
+        </w:numPr>
+      </w:pPr>
+      <w:r>
+        <w:rPr>
+          <w:noProof/>
+        </w:rPr>
+        <w:drawing>
+          <wp:anchor distT="0" distB="0" distL="114300" distR="114300" simplePos="0" relativeHeight="251669504" behindDoc="0" locked="0" layoutInCell="1" allowOverlap="1" wp14:anchorId="357521EE" wp14:editId="0F16B8E2">
+            <wp:simplePos x="0" y="0"/>
+            <wp:positionH relativeFrom="column">
+              <wp:posOffset>323850</wp:posOffset>
+            </wp:positionH>
+            <wp:positionV relativeFrom="paragraph">
+              <wp:posOffset>266065</wp:posOffset>
+            </wp:positionV>
+            <wp:extent cx="2164080" cy="4418330"/>
+            <wp:effectExtent l="0" t="0" r="7620" b="1270"/>
+            <wp:wrapTopAndBottom/>
+            <wp:docPr id="2017308389" name="Picture 1"/>
+            <wp:cNvGraphicFramePr>
+              <a:graphicFrameLocks xmlns:a="http://schemas.openxmlformats.org/drawingml/2006/main" noChangeAspect="1"/>
+            </wp:cNvGraphicFramePr>
+            <a:graphic xmlns:a="http://schemas.openxmlformats.org/drawingml/2006/main">
+              <a:graphicData uri="http://schemas.openxmlformats.org/drawingml/2006/picture">
+                <pic:pic xmlns:pic="http://schemas.openxmlformats.org/drawingml/2006/picture">
+                  <pic:nvPicPr>
+                    <pic:cNvPr id="2017308389" name=""/>
+                    <pic:cNvPicPr/>
+                  </pic:nvPicPr>
+                  <pic:blipFill>
+                    <a:blip r:embed="rId15">
+                      <a:extLst>
+                        <a:ext uri="{28A0092B-C50C-407E-A947-70E740481C1C}">
+                          <a14:useLocalDpi xmlns:a14="http://schemas.microsoft.com/office/drawing/2010/main" val="0"/>
+                        </a:ext>
+                      </a:extLst>
+                    </a:blip>
+                    <a:stretch>
+                      <a:fillRect/>
+                    </a:stretch>
+                  </pic:blipFill>
+                  <pic:spPr>
+                    <a:xfrm>
+                      <a:off x="0" y="0"/>
+                      <a:ext cx="2164080" cy="4418330"/>
+                    </a:xfrm>
+                    <a:prstGeom prst="rect">
+                      <a:avLst/>
+                    </a:prstGeom>
+                  </pic:spPr>
+                </pic:pic>
+              </a:graphicData>
+            </a:graphic>
+            <wp14:sizeRelH relativeFrom="margin">
+              <wp14:pctWidth>0</wp14:pctWidth>
+            </wp14:sizeRelH>
+            <wp14:sizeRelV relativeFrom="margin">
+              <wp14:pctHeight>0</wp14:pctHeight>
+            </wp14:sizeRelV>
+          </wp:anchor>
+        </w:drawing>
+      </w:r>
+      <w:r>
+        <w:t>王一雪在做什么？</w:t>
+      </w:r>
+    </w:p>
+    <w:p>
+      <w:pPr>
+        <w:ind w:left="720"/>
+      </w:pPr>
+      <w:r>
+        <w:t xml:space="preserve">Nên trình bày </w:t>
+      </w:r>
+    </w:p>
+    <w:p>
+      <w:pPr>
+        <w:numPr>
+          <w:ilvl w:val="0"/>
+          <w:numId w:val="16"/>
+        </w:numPr>
+      </w:pPr>
+      <w:r>
+        <w:t>谁来接白家月了？</w:t>
+      </w:r>
+      <w:r>
+        <w:t xml:space="preserve"> </w:t>
+      </w:r>
+    </w:p>
+    <w:p>
+      <w:pPr>
+        <w:ind w:left="720"/>
+      </w:pPr>
+      <w:r>
+        <w:lastRenderedPageBreak/>
+        <w:t>— </w:t>
+      </w:r>
+      <w:r>
+        <w:rPr>
+          <w:b/>
+          <w:bCs/>
+        </w:rPr>
+        <w:t xml:space="preserve">A. </w:t>
+      </w:r>
+      <w:r>
+        <w:rPr>
+          <w:b/>
+          <w:bCs/>
+        </w:rPr>
+        <w:t>王一飞</w:t>
+      </w:r>
+      <w:r>
+        <w:rPr>
+          <w:b/>
+          <w:bCs/>
+        </w:rPr>
+        <w:t xml:space="preserve"> · B. </w:t>
+      </w:r>
+      <w:r>
+        <w:rPr>
+          <w:b/>
+          <w:bCs/>
+        </w:rPr>
+        <w:t>王一雪</w:t>
+      </w:r>
+      <w:r>
+        <w:rPr>
+          <w:b/>
+          <w:bCs/>
+        </w:rPr>
+        <w:t xml:space="preserve"> · C. </w:t>
+      </w:r>
+      <w:r>
+        <w:rPr>
+          <w:b/>
+          <w:bCs/>
+        </w:rPr>
+        <w:t>她的姐姐</w:t>
+      </w:r>
+    </w:p>
+    <w:p>
+      <w:pPr>
+        <w:numPr>
+          <w:ilvl w:val="0"/>
+          <w:numId w:val="17"/>
+        </w:numPr>
+      </w:pPr>
+      <w:r>
+        <w:t>王一飞给谁打电话了？</w:t>
+      </w:r>
+      <w:r>
+        <w:t xml:space="preserve"> </w:t>
+      </w:r>
+    </w:p>
+    <w:p>
+      <w:pPr>
+        <w:ind w:left="720"/>
+        <w:rPr>
+          <w:b/>
+          <w:bCs/>
+        </w:rPr>
+      </w:pPr>
+      <w:r>
+        <w:t>— </w:t>
+      </w:r>
+      <w:r>
+        <w:rPr>
+          <w:b/>
+          <w:bCs/>
+        </w:rPr>
+        <w:t xml:space="preserve">A. </w:t>
+      </w:r>
+      <w:r>
+        <w:rPr>
+          <w:b/>
+          <w:bCs/>
+        </w:rPr>
+        <w:t>安妮</w:t>
+      </w:r>
+      <w:r>
+        <w:rPr>
+          <w:b/>
+          <w:bCs/>
+        </w:rPr>
+        <w:t xml:space="preserve"> · B. </w:t>
+      </w:r>
+      <w:r>
+        <w:rPr>
+          <w:b/>
+          <w:bCs/>
+        </w:rPr>
+        <w:t>白家月</w:t>
+      </w:r>
+      <w:r>
+        <w:rPr>
+          <w:b/>
+          <w:bCs/>
+        </w:rPr>
+        <w:t xml:space="preserve"> · C. </w:t>
+      </w:r>
+      <w:r>
+        <w:rPr>
+          <w:b/>
+          <w:bCs/>
+        </w:rPr>
+        <w:t>王一雪</w:t>
+      </w:r>
+    </w:p>
+    <w:p>
+      <w:pPr>
+        <w:ind w:left="720"/>
+        <w:rPr>
+          <w:b/>
+          <w:bCs/>
+        </w:rPr>
+      </w:pPr>
+      <w:r>
+        <w:rPr>
+          <w:b/>
+          <w:bCs/>
+        </w:rPr>
+        <w:t>Xuống dòng sẽ nhìn tốt hơn ở mobile</w:t>
+      </w:r>
+    </w:p>
+    <w:p>
+      <w:pPr>
+        <w:ind w:left="720"/>
+        <w:rPr>
+          <w:b/>
+          <w:bCs/>
+        </w:rPr>
+      </w:pPr>
+      <w:r>
+        <w:rPr>
+          <w:b/>
+          <w:bCs/>
+        </w:rPr>
+        <w:t>Phần</w:t>
+      </w:r>
+    </w:p>
+    <w:p>
+      <w:pPr>
+        <w:ind w:left="720"/>
+      </w:pPr>
+      <w:r>
+        <w:rPr>
+          <w:b/>
+          <w:bCs/>
+        </w:rPr>
+        <w:t>语法</w:t>
+      </w:r>
+    </w:p>
+    <w:p>
+      <w:pPr>
+        <w:ind w:left="720"/>
+        <w:rPr>
+          <w:b/>
+          <w:bCs/>
+        </w:rPr>
+      </w:pPr>
+      <w:r>
+        <w:rPr>
+          <w:b/>
+          <w:bCs/>
+        </w:rPr>
+        <w:t>Lớp học của Tiểu Ngữ — Ngữ pháp</w:t>
+      </w:r>
+    </w:p>
+    <w:p>
+      <w:pPr>
+        <w:ind w:left="720"/>
+        <w:rPr>
+          <w:b/>
+          <w:bCs/>
+        </w:rPr>
+      </w:pPr>
+      <w:r>
+        <w:rPr>
+          <w:b/>
+          <w:bCs/>
+        </w:rPr>
+        <w:t>Câu mẫu</w:t>
+      </w:r>
+    </w:p>
+    <w:p>
+      <w:pPr>
+        <w:ind w:left="720"/>
+        <w:rPr>
+          <w:b/>
+          <w:bCs/>
+        </w:rPr>
+      </w:pPr>
+      <w:r>
+        <w:rPr>
+          <w:b/>
+          <w:bCs/>
+        </w:rPr>
+        <w:t>汉拼</w:t>
+      </w:r>
+      <w:r>
+        <w:rPr>
+          <w:b/>
+          <w:bCs/>
+        </w:rPr>
+        <w:t>Vi</w:t>
+      </w:r>
+    </w:p>
+    <w:p>
+      <w:pPr>
+        <w:ind w:left="720"/>
+        <w:rPr>
+          <w:b/>
+          <w:bCs/>
+        </w:rPr>
+      </w:pPr>
+      <w:r>
+        <w:rPr>
+          <w:b/>
+          <w:bCs/>
+        </w:rPr>
+        <w:t>Trợ từ ngữ khí “</w:t>
+      </w:r>
+      <w:r>
+        <w:rPr>
+          <w:b/>
+          <w:bCs/>
+        </w:rPr>
+        <w:t>吧</w:t>
+      </w:r>
+      <w:r>
+        <w:rPr>
+          <w:b/>
+          <w:bCs/>
+        </w:rPr>
+        <w:t>” (2)</w:t>
+      </w:r>
+    </w:p>
+    <w:p>
+      <w:pPr>
+        <w:ind w:left="720"/>
+      </w:pPr>
+      <w:r>
+        <w:rPr>
+          <w:b/>
+          <w:bCs/>
+        </w:rPr>
+        <w:t>Nội dung:</w:t>
+      </w:r>
+      <w:r>
+        <w:t> </w:t>
+      </w:r>
+      <w:r>
+        <w:rPr>
+          <w:b/>
+          <w:bCs/>
+        </w:rPr>
+        <w:t>吧</w:t>
+      </w:r>
+      <w:r>
+        <w:t> đặt cuối câu nghi vấn để biểu thị phỏng đoán hoặc ước lượng.</w:t>
+      </w:r>
+    </w:p>
+    <w:p>
+      <w:pPr>
+        <w:ind w:left="720"/>
+        <w:rPr>
+          <w:b/>
+          <w:bCs/>
+        </w:rPr>
+      </w:pPr>
+      <w:r>
+        <w:rPr>
+          <w:b/>
+          <w:bCs/>
+        </w:rPr>
+        <w:t>Bài luyện</w:t>
+      </w:r>
+    </w:p>
+    <w:p>
+      <w:pPr>
+        <w:ind w:left="720"/>
+      </w:pPr>
+      <w:r>
+        <w:t>Hoàn thành các đoạn hội thoại/câu sau:</w:t>
+      </w:r>
+    </w:p>
+    <w:p>
+      <w:pPr>
+        <w:numPr>
+          <w:ilvl w:val="0"/>
+          <w:numId w:val="18"/>
+        </w:numPr>
+      </w:pPr>
+      <w:r>
+        <w:t>A</w:t>
+      </w:r>
+      <w:r>
+        <w:t>：这是</w:t>
+      </w:r>
+      <w:r>
+        <w:t>____________</w:t>
+      </w:r>
+      <w:r>
+        <w:t>？</w:t>
+      </w:r>
+      <w:r>
+        <w:t xml:space="preserve"> B</w:t>
+      </w:r>
+      <w:r>
+        <w:t>：对，是我的手机，谢谢你！</w:t>
+      </w:r>
+    </w:p>
+    <w:p>
+      <w:pPr>
+        <w:numPr>
+          <w:ilvl w:val="0"/>
+          <w:numId w:val="18"/>
+        </w:numPr>
+      </w:pPr>
+      <w:r>
+        <w:t>A</w:t>
+      </w:r>
+      <w:r>
+        <w:t>：你</w:t>
+      </w:r>
+      <w:r>
+        <w:t>____________</w:t>
+      </w:r>
+      <w:r>
+        <w:t>？认识你很高兴。</w:t>
+      </w:r>
+      <w:r>
+        <w:t xml:space="preserve"> B</w:t>
+      </w:r>
+      <w:r>
+        <w:t>：是。认识你，我也很高兴。</w:t>
+      </w:r>
+    </w:p>
+    <w:p>
+      <w:pPr>
+        <w:numPr>
+          <w:ilvl w:val="0"/>
+          <w:numId w:val="18"/>
+        </w:numPr>
+      </w:pPr>
+      <w:r>
+        <w:t>A</w:t>
+      </w:r>
+      <w:r>
+        <w:t>：很晚了，老师</w:t>
+      </w:r>
+      <w:r>
+        <w:t>____________</w:t>
+      </w:r>
+      <w:r>
+        <w:t>？</w:t>
+      </w:r>
+      <w:r>
+        <w:t xml:space="preserve"> B</w:t>
+      </w:r>
+      <w:r>
+        <w:t>：那我们明天再去学校找她。</w:t>
+      </w:r>
+    </w:p>
+    <w:p>
+      <w:pPr>
+        <w:ind w:left="720"/>
+      </w:pPr>
+    </w:p>
+    <w:p>
+      <w:pPr>
+        <w:ind w:left="720"/>
+      </w:pPr>
+      <w:r>
+        <w:t>Nên là</w:t>
+      </w:r>
+    </w:p>
+    <w:p>
+      <w:pPr>
+        <w:ind w:left="720"/>
+      </w:pPr>
+      <w:r>
+        <w:rPr>
+          <w:b/>
+          <w:bCs/>
+        </w:rPr>
+        <w:t>语法</w:t>
+      </w:r>
+    </w:p>
+    <w:p>
+      <w:pPr>
+        <w:ind w:left="720"/>
+        <w:rPr>
+          <w:b/>
+          <w:bCs/>
+        </w:rPr>
+      </w:pPr>
+      <w:r>
+        <w:rPr>
+          <w:b/>
+          <w:bCs/>
+        </w:rPr>
+        <w:t>Lớp học của Tiểu Ngữ — Ngữ pháp</w:t>
+      </w:r>
+    </w:p>
+    <w:p>
+      <w:pPr>
+        <w:ind w:left="720"/>
+        <w:rPr>
+          <w:b/>
+          <w:bCs/>
+        </w:rPr>
+      </w:pPr>
+      <w:r>
+        <w:rPr>
+          <w:b/>
+          <w:bCs/>
+        </w:rPr>
+        <w:t>Câu mẫu</w:t>
+      </w:r>
+    </w:p>
+    <w:p>
+      <w:pPr>
+        <w:ind w:left="720"/>
+        <w:rPr>
+          <w:b/>
+          <w:bCs/>
+        </w:rPr>
+      </w:pPr>
+      <w:r>
+        <w:rPr>
+          <w:b/>
+          <w:bCs/>
+        </w:rPr>
+        <w:t>汉拼</w:t>
+      </w:r>
+      <w:r>
+        <w:rPr>
+          <w:b/>
+          <w:bCs/>
+        </w:rPr>
+        <w:t>Vi</w:t>
+      </w:r>
+    </w:p>
+    <w:p>
+      <w:pPr>
+        <w:ind w:left="720"/>
+        <w:rPr>
+          <w:b/>
+          <w:bCs/>
+        </w:rPr>
+      </w:pPr>
+      <w:r>
+        <w:rPr>
+          <w:b/>
+          <w:bCs/>
+        </w:rPr>
+        <w:t>Trợ từ ngữ khí “</w:t>
+      </w:r>
+      <w:r>
+        <w:rPr>
+          <w:b/>
+          <w:bCs/>
+        </w:rPr>
+        <w:t>吧</w:t>
+      </w:r>
+      <w:r>
+        <w:rPr>
+          <w:b/>
+          <w:bCs/>
+        </w:rPr>
+        <w:t>” (2)</w:t>
+      </w:r>
+    </w:p>
+    <w:p>
+      <w:pPr>
+        <w:ind w:left="720"/>
+      </w:pPr>
+      <w:r>
+        <w:rPr>
+          <w:b/>
+          <w:bCs/>
+        </w:rPr>
+        <w:t>Nội dung:</w:t>
+      </w:r>
+      <w:r>
+        <w:t> </w:t>
+      </w:r>
+      <w:r>
+        <w:rPr>
+          <w:b/>
+          <w:bCs/>
+        </w:rPr>
+        <w:t>吧</w:t>
+      </w:r>
+      <w:r>
+        <w:t> đặt cuối câu nghi vấn để biểu thị phỏng đoán hoặc ước lượng.</w:t>
+      </w:r>
+    </w:p>
+    <w:p>
+      <w:pPr>
+        <w:ind w:left="720"/>
+        <w:rPr>
+          <w:b/>
+          <w:bCs/>
+        </w:rPr>
+      </w:pPr>
+      <w:r>
+        <w:rPr>
+          <w:b/>
+          <w:bCs/>
+        </w:rPr>
+        <w:t>Bài luyện</w:t>
+      </w:r>
+    </w:p>
+    <w:p>
+      <w:pPr>
+        <w:ind w:left="720"/>
+      </w:pPr>
+      <w:r>
+        <w:lastRenderedPageBreak/>
+        <w:t>Hoàn thành các đoạn hội thoại/câu sau:</w:t>
+      </w:r>
+    </w:p>
+    <w:p>
+      <w:pPr>
+        <w:numPr>
+          <w:ilvl w:val="0"/>
+          <w:numId w:val="19"/>
+        </w:numPr>
+      </w:pPr>
+      <w:r>
+        <w:t>A</w:t>
+      </w:r>
+      <w:r>
+        <w:t>：这是</w:t>
+      </w:r>
+      <w:r>
+        <w:t>____________</w:t>
+      </w:r>
+      <w:r>
+        <w:t>？</w:t>
+      </w:r>
+      <w:r>
+        <w:t xml:space="preserve"> </w:t>
+      </w:r>
+    </w:p>
+    <w:p>
+      <w:pPr>
+        <w:ind w:left="720"/>
+      </w:pPr>
+      <w:r>
+        <w:t>B</w:t>
+      </w:r>
+      <w:r>
+        <w:t>：对，是我的手机，谢谢你！</w:t>
+      </w:r>
+    </w:p>
+    <w:p>
+      <w:pPr>
+        <w:numPr>
+          <w:ilvl w:val="0"/>
+          <w:numId w:val="19"/>
+        </w:numPr>
+      </w:pPr>
+      <w:r>
+        <w:t>A</w:t>
+      </w:r>
+      <w:r>
+        <w:t>：你</w:t>
+      </w:r>
+      <w:r>
+        <w:t>____________</w:t>
+      </w:r>
+      <w:r>
+        <w:t>？认识你很高兴。</w:t>
+      </w:r>
+      <w:r>
+        <w:t xml:space="preserve"> </w:t>
+      </w:r>
+    </w:p>
+    <w:p>
+      <w:pPr>
+        <w:ind w:left="720"/>
+      </w:pPr>
+      <w:r>
+        <w:t>B</w:t>
+      </w:r>
+      <w:r>
+        <w:t>：是。认识你，我也很高兴。</w:t>
+      </w:r>
+    </w:p>
+    <w:p>
+      <w:pPr>
+        <w:numPr>
+          <w:ilvl w:val="0"/>
+          <w:numId w:val="19"/>
+        </w:numPr>
+      </w:pPr>
+      <w:r>
+        <w:t>A</w:t>
+      </w:r>
+      <w:r>
+        <w:t>：很晚了，老师</w:t>
+      </w:r>
+      <w:r>
+        <w:t>____________</w:t>
+      </w:r>
+      <w:r>
+        <w:t>？</w:t>
+      </w:r>
+      <w:r>
+        <w:t xml:space="preserve"> </w:t>
+      </w:r>
+    </w:p>
+    <w:p>
+      <w:pPr>
+        <w:ind w:left="720"/>
+      </w:pPr>
+      <w:r>
+        <w:rPr>
+          <w:noProof/>
+        </w:rPr>
+        <w:drawing>
+          <wp:anchor distT="0" distB="0" distL="114300" distR="114300" simplePos="0" relativeHeight="251670528" behindDoc="0" locked="0" layoutInCell="1" allowOverlap="1" wp14:anchorId="7FD5E1AC" wp14:editId="3D5E5FD4">
+            <wp:simplePos x="0" y="0"/>
+            <wp:positionH relativeFrom="column">
+              <wp:posOffset>552450</wp:posOffset>
+            </wp:positionH>
+            <wp:positionV relativeFrom="paragraph">
+              <wp:posOffset>483235</wp:posOffset>
+            </wp:positionV>
+            <wp:extent cx="2333625" cy="4919980"/>
+            <wp:effectExtent l="0" t="0" r="9525" b="0"/>
+            <wp:wrapTopAndBottom/>
+            <wp:docPr id="961492401" name="Picture 1"/>
+            <wp:cNvGraphicFramePr>
+              <a:graphicFrameLocks xmlns:a="http://schemas.openxmlformats.org/drawingml/2006/main" noChangeAspect="1"/>
+            </wp:cNvGraphicFramePr>
+            <a:graphic xmlns:a="http://schemas.openxmlformats.org/drawingml/2006/main">
+              <a:graphicData uri="http://schemas.openxmlformats.org/drawingml/2006/picture">
+                <pic:pic xmlns:pic="http://schemas.openxmlformats.org/drawingml/2006/picture">
+                  <pic:nvPicPr>
+                    <pic:cNvPr id="961492401" name=""/>
+                    <pic:cNvPicPr/>
+                  </pic:nvPicPr>
+                  <pic:blipFill>
+                    <a:blip r:embed="rId16">
+                      <a:extLst>
+                        <a:ext uri="{28A0092B-C50C-407E-A947-70E740481C1C}">
+                          <a14:useLocalDpi xmlns:a14="http://schemas.microsoft.com/office/drawing/2010/main" val="0"/>
+                        </a:ext>
+                      </a:extLst>
+                    </a:blip>
+                    <a:stretch>
+                      <a:fillRect/>
+                    </a:stretch>
+                  </pic:blipFill>
+                  <pic:spPr>
+                    <a:xfrm>
+                      <a:off x="0" y="0"/>
+                      <a:ext cx="2333625" cy="4919980"/>
+                    </a:xfrm>
+                    <a:prstGeom prst="rect">
+                      <a:avLst/>
+                    </a:prstGeom>
+                  </pic:spPr>
+                </pic:pic>
+              </a:graphicData>
+            </a:graphic>
+            <wp14:sizeRelH relativeFrom="margin">
+              <wp14:pctWidth>0</wp14:pctWidth>
+            </wp14:sizeRelH>
+            <wp14:sizeRelV relativeFrom="margin">
+              <wp14:pctHeight>0</wp14:pctHeight>
+            </wp14:sizeRelV>
+          </wp:anchor>
+        </w:drawing>
+      </w:r>
+      <w:r>
+        <w:t>B</w:t>
+      </w:r>
+      <w:r>
+        <w:t>：那我们明天再去学校找她。</w:t>
+      </w:r>
+    </w:p>
+    <w:p>
+      <w:r>
+        <w:t>Cần xem xét việc ngắt xuống dòng áp dụng đối với tất cả</w:t>
+      </w:r>
+      <w:r>
+        <w:t xml:space="preserve"> kiểm tra lại với hsk 1 luôn nha</w:t>
+      </w:r>
+    </w:p>
+    <w:p>
+      <w:r>
+        <w:rPr>
+          <w:rFonts w:ascii="Segoe UI Symbol" w:hAnsi="Segoe UI Symbol" w:cs="Segoe UI Symbol"/>
+          <w:b/>
+          <w:bCs/>
+        </w:rPr>
+        <w:t>✓</w:t>
+      </w:r>
+    </w:p>
+    <w:p>
+      <w:pPr>
+        <w:rPr>
+          <w:b/>
+          <w:bCs/>
+        </w:rPr>
+      </w:pPr>
+      <w:r>
+        <w:rPr>
+          <w:b/>
+          <w:bCs/>
+        </w:rPr>
+        <w:lastRenderedPageBreak/>
+        <w:t>Tổng kết học tập</w:t>
+      </w:r>
+    </w:p>
+    <w:p>
+      <w:r>
+        <w:t>Đánh dấu theo mức độ hiện tại của bạn. Lựa chọn được lưu trên thiết bị này.</w:t>
+      </w:r>
+    </w:p>
+    <w:tbl>
+      <w:tblPr>
+        <w:tblW w:w="11400" w:type="dxa"/>
+        <w:shd w:val="clear" w:color="auto" w:fill="FFFFFF"/>
+        <w:tblCellMar>
+          <w:top w:w="15" w:type="dxa"/>
+          <w:left w:w="15" w:type="dxa"/>
+          <w:bottom w:w="15" w:type="dxa"/>
+          <w:right w:w="15" w:type="dxa"/>
+        </w:tblCellMar>
+        <w:tblLook w:val="04A0" w:firstRow="1" w:lastRow="0" w:firstColumn="1" w:lastColumn="0" w:noHBand="0" w:noVBand="1"/>
+      </w:tblPr>
+      <w:tblGrid>
+        <w:gridCol w:w="690"/>
+        <w:gridCol w:w="4787"/>
+        <w:gridCol w:w="3163"/>
+        <w:gridCol w:w="1380"/>
+        <w:gridCol w:w="1380"/>
+      </w:tblGrid>
+      <w:tr>
+        <w:trPr>
+          <w:tblHeader/>
+        </w:trPr>
+        <w:tc>
+          <w:tcPr>
+            <w:tcW w:w="690" w:type="dxa"/>
+            <w:tcBorders>
+              <w:bottom w:val="single" w:sz="6" w:space="0" w:color="E7EEEB"/>
+            </w:tcBorders>
+            <w:shd w:val="clear" w:color="auto" w:fill="EEF7F3"/>
+            <w:tcMar>
+              <w:top w:w="135" w:type="dxa"/>
+              <w:left w:w="150" w:type="dxa"/>
+              <w:bottom w:w="135" w:type="dxa"/>
+              <w:right w:w="150" w:type="dxa"/>
+            </w:tcMar>
+            <w:vAlign w:val="center"/>
+            <w:hideMark/>
+          </w:tcPr>
+          <w:p>
+            <w:pPr>
+              <w:rPr>
+                <w:b/>
+                <w:bCs/>
+              </w:rPr>
+            </w:pPr>
+            <w:r>
+              <w:rPr>
+                <w:b/>
+                <w:bCs/>
+              </w:rPr>
+              <w:t>STT</w:t>
+            </w:r>
+          </w:p>
+        </w:tc>
+        <w:tc>
+          <w:tcPr>
+            <w:tcW w:w="0" w:type="auto"/>
+            <w:tcBorders>
+              <w:bottom w:val="single" w:sz="6" w:space="0" w:color="E7EEEB"/>
+            </w:tcBorders>
+            <w:shd w:val="clear" w:color="auto" w:fill="EEF7F3"/>
+            <w:tcMar>
+              <w:top w:w="135" w:type="dxa"/>
+              <w:left w:w="150" w:type="dxa"/>
+              <w:bottom w:w="135" w:type="dxa"/>
+              <w:right w:w="150" w:type="dxa"/>
+            </w:tcMar>
+            <w:vAlign w:val="center"/>
+            <w:hideMark/>
+          </w:tcPr>
+          <w:p>
+            <w:pPr>
+              <w:rPr>
+                <w:b/>
+                <w:bCs/>
+              </w:rPr>
+            </w:pPr>
+            <w:r>
+              <w:rPr>
+                <w:b/>
+                <w:bCs/>
+              </w:rPr>
+              <w:t>Nội dung</w:t>
+            </w:r>
+          </w:p>
+        </w:tc>
+        <w:tc>
+          <w:tcPr>
+            <w:tcW w:w="0" w:type="auto"/>
+            <w:tcBorders>
+              <w:bottom w:val="single" w:sz="6" w:space="0" w:color="E7EEEB"/>
+            </w:tcBorders>
+            <w:shd w:val="clear" w:color="auto" w:fill="EEF7F3"/>
+            <w:tcMar>
+              <w:top w:w="135" w:type="dxa"/>
+              <w:left w:w="150" w:type="dxa"/>
+              <w:bottom w:w="135" w:type="dxa"/>
+              <w:right w:w="150" w:type="dxa"/>
+            </w:tcMar>
+            <w:vAlign w:val="center"/>
+            <w:hideMark/>
+          </w:tcPr>
+          <w:p>
+            <w:pPr>
+              <w:rPr>
+                <w:b/>
+                <w:bCs/>
+              </w:rPr>
+            </w:pPr>
+            <w:r>
+              <w:rPr>
+                <w:b/>
+                <w:bCs/>
+              </w:rPr>
+              <w:t>Ví dụ trong sách</w:t>
+            </w:r>
+          </w:p>
+        </w:tc>
+        <w:tc>
+          <w:tcPr>
+            <w:tcW w:w="1380" w:type="dxa"/>
+            <w:tcBorders>
+              <w:bottom w:val="single" w:sz="6" w:space="0" w:color="E7EEEB"/>
+            </w:tcBorders>
+            <w:shd w:val="clear" w:color="auto" w:fill="EEF7F3"/>
+            <w:tcMar>
+              <w:top w:w="135" w:type="dxa"/>
+              <w:left w:w="150" w:type="dxa"/>
+              <w:bottom w:w="135" w:type="dxa"/>
+              <w:right w:w="150" w:type="dxa"/>
+            </w:tcMar>
+            <w:vAlign w:val="center"/>
+            <w:hideMark/>
+          </w:tcPr>
+          <w:p>
+            <w:pPr>
+              <w:rPr>
+                <w:b/>
+                <w:bCs/>
+              </w:rPr>
+            </w:pPr>
+            <w:r>
+              <w:rPr>
+                <w:b/>
+                <w:bCs/>
+              </w:rPr>
+              <w:t>Đã hiểu</w:t>
+            </w:r>
+          </w:p>
+        </w:tc>
+        <w:tc>
+          <w:tcPr>
+            <w:tcW w:w="1380" w:type="dxa"/>
+            <w:tcBorders>
+              <w:bottom w:val="single" w:sz="6" w:space="0" w:color="E7EEEB"/>
+            </w:tcBorders>
+            <w:shd w:val="clear" w:color="auto" w:fill="EEF7F3"/>
+            <w:tcMar>
+              <w:top w:w="135" w:type="dxa"/>
+              <w:left w:w="150" w:type="dxa"/>
+              <w:bottom w:w="135" w:type="dxa"/>
+              <w:right w:w="150" w:type="dxa"/>
+            </w:tcMar>
+            <w:vAlign w:val="center"/>
+            <w:hideMark/>
+          </w:tcPr>
+          <w:p>
+            <w:pPr>
+              <w:rPr>
+                <w:b/>
+                <w:bCs/>
+              </w:rPr>
+            </w:pPr>
+            <w:r>
+              <w:rPr>
+                <w:b/>
+                <w:bCs/>
+              </w:rPr>
+              <w:t>Biết dùng</w:t>
+            </w:r>
+          </w:p>
+        </w:tc>
+      </w:tr>
+      <w:tr>
+        <w:tc>
+          <w:tcPr>
+            <w:tcW w:w="690" w:type="dxa"/>
+            <w:tcBorders>
+              <w:bottom w:val="single" w:sz="6" w:space="0" w:color="E7EEEB"/>
+            </w:tcBorders>
+            <w:shd w:val="clear" w:color="auto" w:fill="FFFFFF"/>
+            <w:tcMar>
+              <w:top w:w="135" w:type="dxa"/>
+              <w:left w:w="150" w:type="dxa"/>
+              <w:bottom w:w="135" w:type="dxa"/>
+              <w:right w:w="150" w:type="dxa"/>
+            </w:tcMar>
+            <w:vAlign w:val="center"/>
+            <w:hideMark/>
+          </w:tcPr>
+          <w:p>
+            <w:r>
+              <w:t>1</w:t>
+            </w:r>
+          </w:p>
+        </w:tc>
+        <w:tc>
+          <w:tcPr>
+            <w:tcW w:w="0" w:type="auto"/>
+            <w:tcBorders>
+              <w:bottom w:val="single" w:sz="6" w:space="0" w:color="E7EEEB"/>
+            </w:tcBorders>
+            <w:shd w:val="clear" w:color="auto" w:fill="FFFFFF"/>
+            <w:tcMar>
+              <w:top w:w="135" w:type="dxa"/>
+              <w:left w:w="150" w:type="dxa"/>
+              <w:bottom w:w="135" w:type="dxa"/>
+              <w:right w:w="150" w:type="dxa"/>
+            </w:tcMar>
+            <w:vAlign w:val="center"/>
+            <w:hideMark/>
+          </w:tcPr>
+          <w:p>
+            <w:r>
+              <w:t>câu hai tân ngữ (2)</w:t>
+            </w:r>
+          </w:p>
+        </w:tc>
+        <w:tc>
+          <w:tcPr>
+            <w:tcW w:w="0" w:type="auto"/>
+            <w:tcBorders>
+              <w:bottom w:val="single" w:sz="6" w:space="0" w:color="E7EEEB"/>
+            </w:tcBorders>
+            <w:shd w:val="clear" w:color="auto" w:fill="FFFFFF"/>
+            <w:tcMar>
+              <w:top w:w="135" w:type="dxa"/>
+              <w:left w:w="150" w:type="dxa"/>
+              <w:bottom w:w="135" w:type="dxa"/>
+              <w:right w:w="150" w:type="dxa"/>
+            </w:tcMar>
+            <w:vAlign w:val="center"/>
+            <w:hideMark/>
+          </w:tcPr>
+          <w:p>
+            <w:r>
+              <w:rPr>
+                <w:b/>
+                <w:bCs/>
+              </w:rPr>
+              <w:t>—</w:t>
+            </w:r>
+          </w:p>
+        </w:tc>
+        <w:tc>
+          <w:tcPr>
+            <w:tcW w:w="1380" w:type="dxa"/>
+            <w:tcBorders>
+              <w:bottom w:val="single" w:sz="6" w:space="0" w:color="E7EEEB"/>
+            </w:tcBorders>
+            <w:shd w:val="clear" w:color="auto" w:fill="FFFFFF"/>
+            <w:tcMar>
+              <w:top w:w="135" w:type="dxa"/>
+              <w:left w:w="150" w:type="dxa"/>
+              <w:bottom w:w="135" w:type="dxa"/>
+              <w:right w:w="150" w:type="dxa"/>
+            </w:tcMar>
+            <w:vAlign w:val="center"/>
+            <w:hideMark/>
+          </w:tcPr>
+          <w:p>
+            <w:r>
+              <w:t>Đã hiểu</w:t>
+            </w:r>
+          </w:p>
+        </w:tc>
+        <w:tc>
+          <w:tcPr>
+            <w:tcW w:w="1380" w:type="dxa"/>
+            <w:tcBorders>
+              <w:bottom w:val="single" w:sz="6" w:space="0" w:color="E7EEEB"/>
+            </w:tcBorders>
+            <w:shd w:val="clear" w:color="auto" w:fill="FFFFFF"/>
+            <w:tcMar>
+              <w:top w:w="135" w:type="dxa"/>
+              <w:left w:w="150" w:type="dxa"/>
+              <w:bottom w:w="135" w:type="dxa"/>
+              <w:right w:w="150" w:type="dxa"/>
+            </w:tcMar>
+            <w:vAlign w:val="center"/>
+            <w:hideMark/>
+          </w:tcPr>
+          <w:p>
+            <w:r>
+              <w:t>Biết dùng</w:t>
+            </w:r>
+          </w:p>
+        </w:tc>
+      </w:tr>
+      <w:tr>
+        <w:tc>
+          <w:tcPr>
+            <w:tcW w:w="690" w:type="dxa"/>
+            <w:tcBorders>
+              <w:bottom w:val="single" w:sz="6" w:space="0" w:color="E7EEEB"/>
+            </w:tcBorders>
+            <w:shd w:val="clear" w:color="auto" w:fill="FFFFFF"/>
+            <w:tcMar>
+              <w:top w:w="135" w:type="dxa"/>
+              <w:left w:w="150" w:type="dxa"/>
+              <w:bottom w:w="135" w:type="dxa"/>
+              <w:right w:w="150" w:type="dxa"/>
+            </w:tcMar>
+            <w:vAlign w:val="center"/>
+            <w:hideMark/>
+          </w:tcPr>
+          <w:p>
+            <w:r>
+              <w:t>2</w:t>
+            </w:r>
+          </w:p>
+        </w:tc>
+        <w:tc>
+          <w:tcPr>
+            <w:tcW w:w="0" w:type="auto"/>
+            <w:tcBorders>
+              <w:bottom w:val="single" w:sz="6" w:space="0" w:color="E7EEEB"/>
+            </w:tcBorders>
+            <w:shd w:val="clear" w:color="auto" w:fill="FFFFFF"/>
+            <w:tcMar>
+              <w:top w:w="135" w:type="dxa"/>
+              <w:left w:w="150" w:type="dxa"/>
+              <w:bottom w:w="135" w:type="dxa"/>
+              <w:right w:w="150" w:type="dxa"/>
+            </w:tcMar>
+            <w:vAlign w:val="center"/>
+            <w:hideMark/>
+          </w:tcPr>
+          <w:p>
+            <w:r>
+              <w:t>câu so sánh (7), (8)</w:t>
+            </w:r>
+          </w:p>
+        </w:tc>
+        <w:tc>
+          <w:tcPr>
+            <w:tcW w:w="0" w:type="auto"/>
+            <w:tcBorders>
+              <w:bottom w:val="single" w:sz="6" w:space="0" w:color="E7EEEB"/>
+            </w:tcBorders>
+            <w:shd w:val="clear" w:color="auto" w:fill="FFFFFF"/>
+            <w:tcMar>
+              <w:top w:w="135" w:type="dxa"/>
+              <w:left w:w="150" w:type="dxa"/>
+              <w:bottom w:w="135" w:type="dxa"/>
+              <w:right w:w="150" w:type="dxa"/>
+            </w:tcMar>
+            <w:vAlign w:val="center"/>
+            <w:hideMark/>
+          </w:tcPr>
+          <w:p>
+            <w:r>
+              <w:rPr>
+                <w:b/>
+                <w:bCs/>
+              </w:rPr>
+              <w:t>—</w:t>
+            </w:r>
+          </w:p>
+        </w:tc>
+        <w:tc>
+          <w:tcPr>
+            <w:tcW w:w="1380" w:type="dxa"/>
+            <w:tcBorders>
+              <w:bottom w:val="single" w:sz="6" w:space="0" w:color="E7EEEB"/>
+            </w:tcBorders>
+            <w:shd w:val="clear" w:color="auto" w:fill="FFFFFF"/>
+            <w:tcMar>
+              <w:top w:w="135" w:type="dxa"/>
+              <w:left w:w="150" w:type="dxa"/>
+              <w:bottom w:w="135" w:type="dxa"/>
+              <w:right w:w="150" w:type="dxa"/>
+            </w:tcMar>
+            <w:vAlign w:val="center"/>
+            <w:hideMark/>
+          </w:tcPr>
+          <w:p>
+            <w:r>
+              <w:t>Đã hiểu</w:t>
+            </w:r>
+          </w:p>
+        </w:tc>
+        <w:tc>
+          <w:tcPr>
+            <w:tcW w:w="1380" w:type="dxa"/>
+            <w:tcBorders>
+              <w:bottom w:val="single" w:sz="6" w:space="0" w:color="E7EEEB"/>
+            </w:tcBorders>
+            <w:shd w:val="clear" w:color="auto" w:fill="FFFFFF"/>
+            <w:tcMar>
+              <w:top w:w="135" w:type="dxa"/>
+              <w:left w:w="150" w:type="dxa"/>
+              <w:bottom w:w="135" w:type="dxa"/>
+              <w:right w:w="150" w:type="dxa"/>
+            </w:tcMar>
+            <w:vAlign w:val="center"/>
+            <w:hideMark/>
+          </w:tcPr>
+          <w:p>
+            <w:r>
+              <w:t>Biết dùng</w:t>
+            </w:r>
+          </w:p>
+        </w:tc>
+      </w:tr>
+      <w:tr>
+        <w:tc>
+          <w:tcPr>
+            <w:tcW w:w="690" w:type="dxa"/>
+            <w:tcBorders>
+              <w:bottom w:val="single" w:sz="6" w:space="0" w:color="E7EEEB"/>
+            </w:tcBorders>
+            <w:shd w:val="clear" w:color="auto" w:fill="FFFFFF"/>
+            <w:tcMar>
+              <w:top w:w="135" w:type="dxa"/>
+              <w:left w:w="150" w:type="dxa"/>
+              <w:bottom w:w="135" w:type="dxa"/>
+              <w:right w:w="150" w:type="dxa"/>
+            </w:tcMar>
+            <w:vAlign w:val="center"/>
+            <w:hideMark/>
+          </w:tcPr>
+          <w:p>
+            <w:r>
+              <w:t>3</w:t>
+            </w:r>
+          </w:p>
+        </w:tc>
+        <w:tc>
+          <w:tcPr>
+            <w:tcW w:w="0" w:type="auto"/>
+            <w:tcBorders>
+              <w:bottom w:val="single" w:sz="6" w:space="0" w:color="E7EEEB"/>
+            </w:tcBorders>
+            <w:shd w:val="clear" w:color="auto" w:fill="FFFFFF"/>
+            <w:tcMar>
+              <w:top w:w="135" w:type="dxa"/>
+              <w:left w:w="150" w:type="dxa"/>
+              <w:bottom w:w="135" w:type="dxa"/>
+              <w:right w:w="150" w:type="dxa"/>
+            </w:tcMar>
+            <w:vAlign w:val="center"/>
+            <w:hideMark/>
+          </w:tcPr>
+          <w:p>
+            <w:r>
+              <w:t>câu tồn hiện (2)</w:t>
+            </w:r>
+          </w:p>
+        </w:tc>
+        <w:tc>
+          <w:tcPr>
+            <w:tcW w:w="0" w:type="auto"/>
+            <w:tcBorders>
+              <w:bottom w:val="single" w:sz="6" w:space="0" w:color="E7EEEB"/>
+            </w:tcBorders>
+            <w:shd w:val="clear" w:color="auto" w:fill="FFFFFF"/>
+            <w:tcMar>
+              <w:top w:w="135" w:type="dxa"/>
+              <w:left w:w="150" w:type="dxa"/>
+              <w:bottom w:w="135" w:type="dxa"/>
+              <w:right w:w="150" w:type="dxa"/>
+            </w:tcMar>
+            <w:vAlign w:val="center"/>
+            <w:hideMark/>
+          </w:tcPr>
+          <w:p>
+            <w:r>
+              <w:rPr>
+                <w:b/>
+                <w:bCs/>
+              </w:rPr>
+              <w:t>—</w:t>
+            </w:r>
+          </w:p>
+        </w:tc>
+        <w:tc>
+          <w:tcPr>
+            <w:tcW w:w="1380" w:type="dxa"/>
+            <w:tcBorders>
+              <w:bottom w:val="single" w:sz="6" w:space="0" w:color="E7EEEB"/>
+            </w:tcBorders>
+            <w:shd w:val="clear" w:color="auto" w:fill="FFFFFF"/>
+            <w:tcMar>
+              <w:top w:w="135" w:type="dxa"/>
+              <w:left w:w="150" w:type="dxa"/>
+              <w:bottom w:w="135" w:type="dxa"/>
+              <w:right w:w="150" w:type="dxa"/>
+            </w:tcMar>
+            <w:vAlign w:val="center"/>
+            <w:hideMark/>
+          </w:tcPr>
+          <w:p>
+            <w:r>
+              <w:t>Đã hiểu</w:t>
+            </w:r>
+          </w:p>
+        </w:tc>
+        <w:tc>
+          <w:tcPr>
+            <w:tcW w:w="1380" w:type="dxa"/>
+            <w:tcBorders>
+              <w:bottom w:val="single" w:sz="6" w:space="0" w:color="E7EEEB"/>
+            </w:tcBorders>
+            <w:shd w:val="clear" w:color="auto" w:fill="FFFFFF"/>
+            <w:tcMar>
+              <w:top w:w="135" w:type="dxa"/>
+              <w:left w:w="150" w:type="dxa"/>
+              <w:bottom w:w="135" w:type="dxa"/>
+              <w:right w:w="150" w:type="dxa"/>
+            </w:tcMar>
+            <w:vAlign w:val="center"/>
+            <w:hideMark/>
+          </w:tcPr>
+          <w:p>
+            <w:r>
+              <w:t>Biết dùng</w:t>
+            </w:r>
+          </w:p>
+        </w:tc>
+      </w:tr>
+      <w:tr>
+        <w:tc>
+          <w:tcPr>
+            <w:tcW w:w="690" w:type="dxa"/>
+            <w:tcBorders>
+              <w:bottom w:val="single" w:sz="6" w:space="0" w:color="E7EEEB"/>
+            </w:tcBorders>
+            <w:shd w:val="clear" w:color="auto" w:fill="FFFFFF"/>
+            <w:tcMar>
+              <w:top w:w="135" w:type="dxa"/>
+              <w:left w:w="150" w:type="dxa"/>
+              <w:bottom w:w="135" w:type="dxa"/>
+              <w:right w:w="150" w:type="dxa"/>
+            </w:tcMar>
+            <w:vAlign w:val="center"/>
+            <w:hideMark/>
+          </w:tcPr>
+          <w:p>
+            <w:r>
+              <w:t>4</w:t>
+            </w:r>
+          </w:p>
+        </w:tc>
+        <w:tc>
+          <w:tcPr>
+            <w:tcW w:w="0" w:type="auto"/>
+            <w:tcBorders>
+              <w:bottom w:val="single" w:sz="6" w:space="0" w:color="E7EEEB"/>
+            </w:tcBorders>
+            <w:shd w:val="clear" w:color="auto" w:fill="FFFFFF"/>
+            <w:tcMar>
+              <w:top w:w="135" w:type="dxa"/>
+              <w:left w:w="150" w:type="dxa"/>
+              <w:bottom w:w="135" w:type="dxa"/>
+              <w:right w:w="150" w:type="dxa"/>
+            </w:tcMar>
+            <w:vAlign w:val="center"/>
+            <w:hideMark/>
+          </w:tcPr>
+          <w:p>
+            <w:r>
+              <w:t xml:space="preserve">phó từ mức độ </w:t>
+            </w:r>
+            <w:r>
+              <w:t>多</w:t>
+            </w:r>
+          </w:p>
+        </w:tc>
+        <w:tc>
+          <w:tcPr>
+            <w:tcW w:w="0" w:type="auto"/>
+            <w:tcBorders>
+              <w:bottom w:val="single" w:sz="6" w:space="0" w:color="E7EEEB"/>
+            </w:tcBorders>
+            <w:shd w:val="clear" w:color="auto" w:fill="FFFFFF"/>
+            <w:tcMar>
+              <w:top w:w="135" w:type="dxa"/>
+              <w:left w:w="150" w:type="dxa"/>
+              <w:bottom w:w="135" w:type="dxa"/>
+              <w:right w:w="150" w:type="dxa"/>
+            </w:tcMar>
+            <w:vAlign w:val="center"/>
+            <w:hideMark/>
+          </w:tcPr>
+          <w:p>
+            <w:r>
+              <w:rPr>
+                <w:b/>
+                <w:bCs/>
+              </w:rPr>
+              <w:t>—</w:t>
+            </w:r>
+          </w:p>
+        </w:tc>
+        <w:tc>
+          <w:tcPr>
+            <w:tcW w:w="1380" w:type="dxa"/>
+            <w:tcBorders>
+              <w:bottom w:val="single" w:sz="6" w:space="0" w:color="E7EEEB"/>
+            </w:tcBorders>
+            <w:shd w:val="clear" w:color="auto" w:fill="FFFFFF"/>
+            <w:tcMar>
+              <w:top w:w="135" w:type="dxa"/>
+              <w:left w:w="150" w:type="dxa"/>
+              <w:bottom w:w="135" w:type="dxa"/>
+              <w:right w:w="150" w:type="dxa"/>
+            </w:tcMar>
+            <w:vAlign w:val="center"/>
+            <w:hideMark/>
+          </w:tcPr>
+          <w:p>
+            <w:r>
+              <w:t>Đã hiểu</w:t>
+            </w:r>
+          </w:p>
+        </w:tc>
+        <w:tc>
+          <w:tcPr>
+            <w:tcW w:w="1380" w:type="dxa"/>
+            <w:tcBorders>
+              <w:bottom w:val="single" w:sz="6" w:space="0" w:color="E7EEEB"/>
+            </w:tcBorders>
+            <w:shd w:val="clear" w:color="auto" w:fill="FFFFFF"/>
+            <w:tcMar>
+              <w:top w:w="135" w:type="dxa"/>
+              <w:left w:w="150" w:type="dxa"/>
+              <w:bottom w:w="135" w:type="dxa"/>
+              <w:right w:w="150" w:type="dxa"/>
+            </w:tcMar>
+            <w:vAlign w:val="center"/>
+            <w:hideMark/>
+          </w:tcPr>
+          <w:p>
+            <w:r>
+              <w:t>Biết dùng</w:t>
+            </w:r>
+          </w:p>
+        </w:tc>
+      </w:tr>
+      <w:tr>
+        <w:tc>
+          <w:tcPr>
+            <w:tcW w:w="690" w:type="dxa"/>
+            <w:tcBorders>
+              <w:bottom w:val="single" w:sz="6" w:space="0" w:color="E7EEEB"/>
+            </w:tcBorders>
+            <w:shd w:val="clear" w:color="auto" w:fill="FFFFFF"/>
+            <w:tcMar>
+              <w:top w:w="135" w:type="dxa"/>
+              <w:left w:w="150" w:type="dxa"/>
+              <w:bottom w:w="135" w:type="dxa"/>
+              <w:right w:w="150" w:type="dxa"/>
+            </w:tcMar>
+            <w:vAlign w:val="center"/>
+            <w:hideMark/>
+          </w:tcPr>
+          <w:p>
+            <w:r>
+              <w:t>5</w:t>
+            </w:r>
+          </w:p>
+        </w:tc>
+        <w:tc>
+          <w:tcPr>
+            <w:tcW w:w="0" w:type="auto"/>
+            <w:tcBorders>
+              <w:bottom w:val="single" w:sz="6" w:space="0" w:color="E7EEEB"/>
+            </w:tcBorders>
+            <w:shd w:val="clear" w:color="auto" w:fill="FFFFFF"/>
+            <w:tcMar>
+              <w:top w:w="135" w:type="dxa"/>
+              <w:left w:w="150" w:type="dxa"/>
+              <w:bottom w:w="135" w:type="dxa"/>
+              <w:right w:w="150" w:type="dxa"/>
+            </w:tcMar>
+            <w:vAlign w:val="center"/>
+            <w:hideMark/>
+          </w:tcPr>
+          <w:p>
+            <w:r>
+              <w:t>bổ ngữ xu hướng phức</w:t>
+            </w:r>
+          </w:p>
+        </w:tc>
+        <w:tc>
+          <w:tcPr>
+            <w:tcW w:w="0" w:type="auto"/>
+            <w:tcBorders>
+              <w:bottom w:val="single" w:sz="6" w:space="0" w:color="E7EEEB"/>
+            </w:tcBorders>
+            <w:shd w:val="clear" w:color="auto" w:fill="FFFFFF"/>
+            <w:tcMar>
+              <w:top w:w="135" w:type="dxa"/>
+              <w:left w:w="150" w:type="dxa"/>
+              <w:bottom w:w="135" w:type="dxa"/>
+              <w:right w:w="150" w:type="dxa"/>
+            </w:tcMar>
+            <w:vAlign w:val="center"/>
+            <w:hideMark/>
+          </w:tcPr>
+          <w:p>
+            <w:r>
+              <w:rPr>
+                <w:b/>
+                <w:bCs/>
+              </w:rPr>
+              <w:t>—</w:t>
+            </w:r>
+          </w:p>
+        </w:tc>
+        <w:tc>
+          <w:tcPr>
+            <w:tcW w:w="1380" w:type="dxa"/>
+            <w:tcBorders>
+              <w:bottom w:val="single" w:sz="6" w:space="0" w:color="E7EEEB"/>
+            </w:tcBorders>
+            <w:shd w:val="clear" w:color="auto" w:fill="FFFFFF"/>
+            <w:tcMar>
+              <w:top w:w="135" w:type="dxa"/>
+              <w:left w:w="150" w:type="dxa"/>
+              <w:bottom w:w="135" w:type="dxa"/>
+              <w:right w:w="150" w:type="dxa"/>
+            </w:tcMar>
+            <w:vAlign w:val="center"/>
+            <w:hideMark/>
+          </w:tcPr>
+          <w:p>
+            <w:r>
+              <w:t>Đã hiểu</w:t>
+            </w:r>
+          </w:p>
+        </w:tc>
+        <w:tc>
+          <w:tcPr>
+            <w:tcW w:w="1380" w:type="dxa"/>
+            <w:tcBorders>
+              <w:bottom w:val="single" w:sz="6" w:space="0" w:color="E7EEEB"/>
+            </w:tcBorders>
+            <w:shd w:val="clear" w:color="auto" w:fill="FFFFFF"/>
+            <w:tcMar>
+              <w:top w:w="135" w:type="dxa"/>
+              <w:left w:w="150" w:type="dxa"/>
+              <w:bottom w:w="135" w:type="dxa"/>
+              <w:right w:w="150" w:type="dxa"/>
+            </w:tcMar>
+            <w:vAlign w:val="center"/>
+            <w:hideMark/>
+          </w:tcPr>
+          <w:p>
+            <w:r>
+              <w:t>Biết dùng</w:t>
+            </w:r>
+          </w:p>
+        </w:tc>
+      </w:tr>
+      <w:tr>
+        <w:tc>
+          <w:tcPr>
+            <w:tcW w:w="690" w:type="dxa"/>
+            <w:tcBorders>
+              <w:bottom w:val="single" w:sz="6" w:space="0" w:color="E7EEEB"/>
+            </w:tcBorders>
+            <w:shd w:val="clear" w:color="auto" w:fill="FFFFFF"/>
+            <w:tcMar>
+              <w:top w:w="135" w:type="dxa"/>
+              <w:left w:w="150" w:type="dxa"/>
+              <w:bottom w:w="135" w:type="dxa"/>
+              <w:right w:w="150" w:type="dxa"/>
+            </w:tcMar>
+            <w:vAlign w:val="center"/>
+            <w:hideMark/>
+          </w:tcPr>
+          <w:p>
+            <w:r>
+              <w:t>6</w:t>
+            </w:r>
+          </w:p>
+        </w:tc>
+        <w:tc>
+          <w:tcPr>
+            <w:tcW w:w="0" w:type="auto"/>
+            <w:tcBorders>
+              <w:bottom w:val="single" w:sz="6" w:space="0" w:color="E7EEEB"/>
+            </w:tcBorders>
+            <w:shd w:val="clear" w:color="auto" w:fill="FFFFFF"/>
+            <w:tcMar>
+              <w:top w:w="135" w:type="dxa"/>
+              <w:left w:w="150" w:type="dxa"/>
+              <w:bottom w:w="135" w:type="dxa"/>
+              <w:right w:w="150" w:type="dxa"/>
+            </w:tcMar>
+            <w:vAlign w:val="center"/>
+            <w:hideMark/>
+          </w:tcPr>
+          <w:p>
+            <w:r>
+              <w:t>bổ ngữ động lượng (1), (2)</w:t>
+            </w:r>
+          </w:p>
+        </w:tc>
+        <w:tc>
+          <w:tcPr>
+            <w:tcW w:w="0" w:type="auto"/>
+            <w:tcBorders>
+              <w:bottom w:val="single" w:sz="6" w:space="0" w:color="E7EEEB"/>
+            </w:tcBorders>
+            <w:shd w:val="clear" w:color="auto" w:fill="FFFFFF"/>
+            <w:tcMar>
+              <w:top w:w="135" w:type="dxa"/>
+              <w:left w:w="150" w:type="dxa"/>
+              <w:bottom w:w="135" w:type="dxa"/>
+              <w:right w:w="150" w:type="dxa"/>
+            </w:tcMar>
+            <w:vAlign w:val="center"/>
+            <w:hideMark/>
+          </w:tcPr>
+          <w:p>
+            <w:r>
+              <w:rPr>
+                <w:b/>
+                <w:bCs/>
+              </w:rPr>
+              <w:t>—</w:t>
+            </w:r>
+          </w:p>
+        </w:tc>
+        <w:tc>
+          <w:tcPr>
+            <w:tcW w:w="1380" w:type="dxa"/>
+            <w:tcBorders>
+              <w:bottom w:val="single" w:sz="6" w:space="0" w:color="E7EEEB"/>
+            </w:tcBorders>
+            <w:shd w:val="clear" w:color="auto" w:fill="FFFFFF"/>
+            <w:tcMar>
+              <w:top w:w="135" w:type="dxa"/>
+              <w:left w:w="150" w:type="dxa"/>
+              <w:bottom w:w="135" w:type="dxa"/>
+              <w:right w:w="150" w:type="dxa"/>
+            </w:tcMar>
+            <w:vAlign w:val="center"/>
+            <w:hideMark/>
+          </w:tcPr>
+          <w:p>
+            <w:r>
+              <w:t>Đã hiểu</w:t>
+            </w:r>
+          </w:p>
+        </w:tc>
+        <w:tc>
+          <w:tcPr>
+            <w:tcW w:w="1380" w:type="dxa"/>
+            <w:tcBorders>
+              <w:bottom w:val="single" w:sz="6" w:space="0" w:color="E7EEEB"/>
+            </w:tcBorders>
+            <w:shd w:val="clear" w:color="auto" w:fill="FFFFFF"/>
+            <w:tcMar>
+              <w:top w:w="135" w:type="dxa"/>
+              <w:left w:w="150" w:type="dxa"/>
+              <w:bottom w:w="135" w:type="dxa"/>
+              <w:right w:w="150" w:type="dxa"/>
+            </w:tcMar>
+            <w:vAlign w:val="center"/>
+            <w:hideMark/>
+          </w:tcPr>
+          <w:p>
+            <w:r>
+              <w:t>Biết dùng</w:t>
+            </w:r>
+          </w:p>
+        </w:tc>
+      </w:tr>
+      <w:tr>
+        <w:tc>
+          <w:tcPr>
+            <w:tcW w:w="690" w:type="dxa"/>
+            <w:tcBorders>
+              <w:bottom w:val="nil"/>
+            </w:tcBorders>
+            <w:shd w:val="clear" w:color="auto" w:fill="FFFFFF"/>
+            <w:tcMar>
+              <w:top w:w="135" w:type="dxa"/>
+              <w:left w:w="150" w:type="dxa"/>
+              <w:bottom w:w="135" w:type="dxa"/>
+              <w:right w:w="150" w:type="dxa"/>
+            </w:tcMar>
+            <w:vAlign w:val="center"/>
+            <w:hideMark/>
+          </w:tcPr>
+          <w:p>
+            <w:r>
+              <w:t>7</w:t>
+            </w:r>
+          </w:p>
+        </w:tc>
+        <w:tc>
+          <w:tcPr>
+            <w:tcW w:w="0" w:type="auto"/>
+            <w:tcBorders>
+              <w:bottom w:val="nil"/>
+            </w:tcBorders>
+            <w:shd w:val="clear" w:color="auto" w:fill="FFFFFF"/>
+            <w:tcMar>
+              <w:top w:w="135" w:type="dxa"/>
+              <w:left w:w="150" w:type="dxa"/>
+              <w:bottom w:w="135" w:type="dxa"/>
+              <w:right w:w="150" w:type="dxa"/>
+            </w:tcMar>
+            <w:vAlign w:val="center"/>
+            <w:hideMark/>
+          </w:tcPr>
+          <w:p>
+            <w:r>
+              <w:t xml:space="preserve">câu chữ </w:t>
+            </w:r>
+            <w:r>
+              <w:t>有</w:t>
+            </w:r>
+            <w:r>
+              <w:t xml:space="preserve"> (2)</w:t>
+            </w:r>
+          </w:p>
+        </w:tc>
+        <w:tc>
+          <w:tcPr>
+            <w:tcW w:w="0" w:type="auto"/>
+            <w:tcBorders>
+              <w:bottom w:val="nil"/>
+            </w:tcBorders>
+            <w:shd w:val="clear" w:color="auto" w:fill="FFFFFF"/>
+            <w:tcMar>
+              <w:top w:w="135" w:type="dxa"/>
+              <w:left w:w="150" w:type="dxa"/>
+              <w:bottom w:w="135" w:type="dxa"/>
+              <w:right w:w="150" w:type="dxa"/>
+            </w:tcMar>
+            <w:vAlign w:val="center"/>
+            <w:hideMark/>
+          </w:tcPr>
+          <w:p>
+            <w:r>
+              <w:rPr>
+                <w:b/>
+                <w:bCs/>
+              </w:rPr>
+              <w:t>—</w:t>
+            </w:r>
+          </w:p>
+        </w:tc>
+        <w:tc>
+          <w:tcPr>
+            <w:tcW w:w="1380" w:type="dxa"/>
+            <w:tcBorders>
+              <w:bottom w:val="nil"/>
+            </w:tcBorders>
+            <w:shd w:val="clear" w:color="auto" w:fill="FFFFFF"/>
+            <w:tcMar>
+              <w:top w:w="135" w:type="dxa"/>
+              <w:left w:w="150" w:type="dxa"/>
+              <w:bottom w:w="135" w:type="dxa"/>
+              <w:right w:w="150" w:type="dxa"/>
+            </w:tcMar>
+            <w:vAlign w:val="center"/>
+            <w:hideMark/>
+          </w:tcPr>
+          <w:p>
+            <w:r>
+              <w:t>Đã hiểu</w:t>
+            </w:r>
+          </w:p>
+        </w:tc>
+        <w:tc>
+          <w:tcPr>
+            <w:tcW w:w="1380" w:type="dxa"/>
+            <w:tcBorders>
+              <w:bottom w:val="nil"/>
+            </w:tcBorders>
+            <w:shd w:val="clear" w:color="auto" w:fill="FFFFFF"/>
+            <w:tcMar>
+              <w:top w:w="135" w:type="dxa"/>
+              <w:left w:w="150" w:type="dxa"/>
+              <w:bottom w:w="135" w:type="dxa"/>
+              <w:right w:w="150" w:type="dxa"/>
+            </w:tcMar>
+            <w:vAlign w:val="center"/>
+            <w:hideMark/>
+          </w:tcPr>
+          <w:p>
+            <w:r>
+              <w:t>Biết dù</w:t>
+            </w:r>
+          </w:p>
+        </w:tc>
+      </w:tr>
+    </w:tbl>
     <w:p/>
+    <w:p>
+      <w:r>
+        <w:lastRenderedPageBreak/>
+        <w:drawing>
+          <wp:anchor distT="0" distB="0" distL="114300" distR="114300" simplePos="0" relativeHeight="251671552" behindDoc="0" locked="0" layoutInCell="1" allowOverlap="1" wp14:anchorId="289FAB6E" wp14:editId="5260FAEA">
+            <wp:simplePos x="0" y="0"/>
+            <wp:positionH relativeFrom="column">
+              <wp:posOffset>0</wp:posOffset>
+            </wp:positionH>
+            <wp:positionV relativeFrom="paragraph">
+              <wp:posOffset>0</wp:posOffset>
+            </wp:positionV>
+            <wp:extent cx="4067743" cy="7535327"/>
+            <wp:effectExtent l="0" t="0" r="9525" b="8890"/>
+            <wp:wrapTopAndBottom/>
+            <wp:docPr id="1362333808" name="Picture 1"/>
+            <wp:cNvGraphicFramePr>
+              <a:graphicFrameLocks xmlns:a="http://schemas.openxmlformats.org/drawingml/2006/main" noChangeAspect="1"/>
+            </wp:cNvGraphicFramePr>
+            <a:graphic xmlns:a="http://schemas.openxmlformats.org/drawingml/2006/main">
+              <a:graphicData uri="http://schemas.openxmlformats.org/drawingml/2006/picture">
+                <pic:pic xmlns:pic="http://schemas.openxmlformats.org/drawingml/2006/picture">
+                  <pic:nvPicPr>
+                    <pic:cNvPr id="1362333808" name=""/>
+                    <pic:cNvPicPr/>
+                  </pic:nvPicPr>
+                  <pic:blipFill>
+                    <a:blip r:embed="rId17">
+                      <a:extLst>
+                        <a:ext uri="{28A0092B-C50C-407E-A947-70E740481C1C}">
+                          <a14:useLocalDpi xmlns:a14="http://schemas.microsoft.com/office/drawing/2010/main" val="0"/>
+                        </a:ext>
+                      </a:extLst>
+                    </a:blip>
+                    <a:stretch>
+                      <a:fillRect/>
+                    </a:stretch>
+                  </pic:blipFill>
+                  <pic:spPr>
+                    <a:xfrm>
+                      <a:off x="0" y="0"/>
+                      <a:ext cx="4067743" cy="7535327"/>
+                    </a:xfrm>
+                    <a:prstGeom prst="rect">
+                      <a:avLst/>
+                    </a:prstGeom>
+                  </pic:spPr>
+                </pic:pic>
+              </a:graphicData>
+            </a:graphic>
+          </wp:anchor>
+        </w:drawing>
+      </w:r>
+      <w:r>
+        <w:t>trên moblie nó đang bị kéo dài ô nhìn không gọn cần thiết kế lại</w:t>
+      </w:r>
+    </w:p>
     <w:sectPr>
       <w:pgSz w:w="12240" w:h="15840"/>
       <w:pgMar w:top="1440" w:right="1440" w:bottom="1440" w:left="1440" w:header="720" w:footer="720" w:gutter="0"/>
@@ -5247,6 +7382,232 @@
     </w:lvl>
   </w:abstractNum>
   <w:abstractNum w:abstractNumId="2" w15:restartNumberingAfterBreak="0">
+    <w:nsid w:val="17891A06"/>
+    <w:multiLevelType w:val="multilevel"/>
+    <w:tmpl w:val="0826DCDA"/>
+    <w:lvl w:ilvl="0">
+      <w:start w:val="1"/>
+      <w:numFmt w:val="decimal"/>
+      <w:lvlText w:val="%1."/>
+      <w:lvlJc w:val="left"/>
+      <w:pPr>
+        <w:tabs>
+          <w:tab w:val="num" w:pos="720"/>
+        </w:tabs>
+        <w:ind w:left="720" w:hanging="360"/>
+      </w:pPr>
+    </w:lvl>
+    <w:lvl w:ilvl="1" w:tentative="1">
+      <w:start w:val="1"/>
+      <w:numFmt w:val="decimal"/>
+      <w:lvlText w:val="%2."/>
+      <w:lvlJc w:val="left"/>
+      <w:pPr>
+        <w:tabs>
+          <w:tab w:val="num" w:pos="1440"/>
+        </w:tabs>
+        <w:ind w:left="1440" w:hanging="360"/>
+      </w:pPr>
+    </w:lvl>
+    <w:lvl w:ilvl="2" w:tentative="1">
+      <w:start w:val="1"/>
+      <w:numFmt w:val="decimal"/>
+      <w:lvlText w:val="%3."/>
+      <w:lvlJc w:val="left"/>
+      <w:pPr>
+        <w:tabs>
+          <w:tab w:val="num" w:pos="2160"/>
+        </w:tabs>
+        <w:ind w:left="2160" w:hanging="360"/>
+      </w:pPr>
+    </w:lvl>
+    <w:lvl w:ilvl="3" w:tentative="1">
+      <w:start w:val="1"/>
+      <w:numFmt w:val="decimal"/>
+      <w:lvlText w:val="%4."/>
+      <w:lvlJc w:val="left"/>
+      <w:pPr>
+        <w:tabs>
+          <w:tab w:val="num" w:pos="2880"/>
+        </w:tabs>
+        <w:ind w:left="2880" w:hanging="360"/>
+      </w:pPr>
+    </w:lvl>
+    <w:lvl w:ilvl="4" w:tentative="1">
+      <w:start w:val="1"/>
+      <w:numFmt w:val="decimal"/>
+      <w:lvlText w:val="%5."/>
+      <w:lvlJc w:val="left"/>
+      <w:pPr>
+        <w:tabs>
+          <w:tab w:val="num" w:pos="3600"/>
+        </w:tabs>
+        <w:ind w:left="3600" w:hanging="360"/>
+      </w:pPr>
+    </w:lvl>
+    <w:lvl w:ilvl="5" w:tentative="1">
+      <w:start w:val="1"/>
+      <w:numFmt w:val="decimal"/>
+      <w:lvlText w:val="%6."/>
+      <w:lvlJc w:val="left"/>
+      <w:pPr>
+        <w:tabs>
+          <w:tab w:val="num" w:pos="4320"/>
+        </w:tabs>
+        <w:ind w:left="4320" w:hanging="360"/>
+      </w:pPr>
+    </w:lvl>
+    <w:lvl w:ilvl="6" w:tentative="1">
+      <w:start w:val="1"/>
+      <w:numFmt w:val="decimal"/>
+      <w:lvlText w:val="%7."/>
+      <w:lvlJc w:val="left"/>
+      <w:pPr>
+        <w:tabs>
+          <w:tab w:val="num" w:pos="5040"/>
+        </w:tabs>
+        <w:ind w:left="5040" w:hanging="360"/>
+      </w:pPr>
+    </w:lvl>
+    <w:lvl w:ilvl="7" w:tentative="1">
+      <w:start w:val="1"/>
+      <w:numFmt w:val="decimal"/>
+      <w:lvlText w:val="%8."/>
+      <w:lvlJc w:val="left"/>
+      <w:pPr>
+        <w:tabs>
+          <w:tab w:val="num" w:pos="5760"/>
+        </w:tabs>
+        <w:ind w:left="5760" w:hanging="360"/>
+      </w:pPr>
+    </w:lvl>
+    <w:lvl w:ilvl="8" w:tentative="1">
+      <w:start w:val="1"/>
+      <w:numFmt w:val="decimal"/>
+      <w:lvlText w:val="%9."/>
+      <w:lvlJc w:val="left"/>
+      <w:pPr>
+        <w:tabs>
+          <w:tab w:val="num" w:pos="6480"/>
+        </w:tabs>
+        <w:ind w:left="6480" w:hanging="360"/>
+      </w:pPr>
+    </w:lvl>
+  </w:abstractNum>
+  <w:abstractNum w:abstractNumId="3" w15:restartNumberingAfterBreak="0">
+    <w:nsid w:val="1F32730D"/>
+    <w:multiLevelType w:val="multilevel"/>
+    <w:tmpl w:val="FE328D2C"/>
+    <w:lvl w:ilvl="0">
+      <w:start w:val="1"/>
+      <w:numFmt w:val="decimal"/>
+      <w:lvlText w:val="%1."/>
+      <w:lvlJc w:val="left"/>
+      <w:pPr>
+        <w:tabs>
+          <w:tab w:val="num" w:pos="720"/>
+        </w:tabs>
+        <w:ind w:left="720" w:hanging="360"/>
+      </w:pPr>
+    </w:lvl>
+    <w:lvl w:ilvl="1" w:tentative="1">
+      <w:start w:val="1"/>
+      <w:numFmt w:val="decimal"/>
+      <w:lvlText w:val="%2."/>
+      <w:lvlJc w:val="left"/>
+      <w:pPr>
+        <w:tabs>
+          <w:tab w:val="num" w:pos="1440"/>
+        </w:tabs>
+        <w:ind w:left="1440" w:hanging="360"/>
+      </w:pPr>
+    </w:lvl>
+    <w:lvl w:ilvl="2" w:tentative="1">
+      <w:start w:val="1"/>
+      <w:numFmt w:val="decimal"/>
+      <w:lvlText w:val="%3."/>
+      <w:lvlJc w:val="left"/>
+      <w:pPr>
+        <w:tabs>
+          <w:tab w:val="num" w:pos="2160"/>
+        </w:tabs>
+        <w:ind w:left="2160" w:hanging="360"/>
+      </w:pPr>
+    </w:lvl>
+    <w:lvl w:ilvl="3" w:tentative="1">
+      <w:start w:val="1"/>
+      <w:numFmt w:val="decimal"/>
+      <w:lvlText w:val="%4."/>
+      <w:lvlJc w:val="left"/>
+      <w:pPr>
+        <w:tabs>
+          <w:tab w:val="num" w:pos="2880"/>
+        </w:tabs>
+        <w:ind w:left="2880" w:hanging="360"/>
+      </w:pPr>
+    </w:lvl>
+    <w:lvl w:ilvl="4" w:tentative="1">
+      <w:start w:val="1"/>
+      <w:numFmt w:val="decimal"/>
+      <w:lvlText w:val="%5."/>
+      <w:lvlJc w:val="left"/>
+      <w:pPr>
+        <w:tabs>
+          <w:tab w:val="num" w:pos="3600"/>
+        </w:tabs>
+        <w:ind w:left="3600" w:hanging="360"/>
+      </w:pPr>
+    </w:lvl>
+    <w:lvl w:ilvl="5" w:tentative="1">
+      <w:start w:val="1"/>
+      <w:numFmt w:val="decimal"/>
+      <w:lvlText w:val="%6."/>
+      <w:lvlJc w:val="left"/>
+      <w:pPr>
+        <w:tabs>
+          <w:tab w:val="num" w:pos="4320"/>
+        </w:tabs>
+        <w:ind w:left="4320" w:hanging="360"/>
+      </w:pPr>
+    </w:lvl>
+    <w:lvl w:ilvl="6" w:tentative="1">
+      <w:start w:val="1"/>
+      <w:numFmt w:val="decimal"/>
+      <w:lvlText w:val="%7."/>
+      <w:lvlJc w:val="left"/>
+      <w:pPr>
+        <w:tabs>
+          <w:tab w:val="num" w:pos="5040"/>
+        </w:tabs>
+        <w:ind w:left="5040" w:hanging="360"/>
+      </w:pPr>
+    </w:lvl>
+    <w:lvl w:ilvl="7" w:tentative="1">
+      <w:start w:val="1"/>
+      <w:numFmt w:val="decimal"/>
+      <w:lvlText w:val="%8."/>
+      <w:lvlJc w:val="left"/>
+      <w:pPr>
+        <w:tabs>
+          <w:tab w:val="num" w:pos="5760"/>
+        </w:tabs>
+        <w:ind w:left="5760" w:hanging="360"/>
+      </w:pPr>
+    </w:lvl>
+    <w:lvl w:ilvl="8" w:tentative="1">
+      <w:start w:val="1"/>
+      <w:numFmt w:val="decimal"/>
+      <w:lvlText w:val="%9."/>
+      <w:lvlJc w:val="left"/>
+      <w:pPr>
+        <w:tabs>
+          <w:tab w:val="num" w:pos="6480"/>
+        </w:tabs>
+        <w:ind w:left="6480" w:hanging="360"/>
+      </w:pPr>
+    </w:lvl>
+  </w:abstractNum>
+  <w:abstractNum w:abstractNumId="4" w15:restartNumberingAfterBreak="0">
     <w:nsid w:val="209D60CC"/>
     <w:multiLevelType w:val="multilevel"/>
     <w:tmpl w:val="5DBA00EA"/>
@@ -5359,7 +7720,7 @@
       </w:pPr>
     </w:lvl>
   </w:abstractNum>
-  <w:abstractNum w:abstractNumId="3" w15:restartNumberingAfterBreak="0">
+  <w:abstractNum w:abstractNumId="5" w15:restartNumberingAfterBreak="0">
     <w:nsid w:val="2A357F85"/>
     <w:multiLevelType w:val="multilevel"/>
     <w:tmpl w:val="BDB0AA94"/>
@@ -5472,7 +7833,120 @@
       </w:pPr>
     </w:lvl>
   </w:abstractNum>
-  <w:abstractNum w:abstractNumId="4" w15:restartNumberingAfterBreak="0">
+  <w:abstractNum w:abstractNumId="6" w15:restartNumberingAfterBreak="0">
+    <w:nsid w:val="2CF97C98"/>
+    <w:multiLevelType w:val="multilevel"/>
+    <w:tmpl w:val="5D142874"/>
+    <w:lvl w:ilvl="0">
+      <w:start w:val="1"/>
+      <w:numFmt w:val="decimal"/>
+      <w:lvlText w:val="%1."/>
+      <w:lvlJc w:val="left"/>
+      <w:pPr>
+        <w:tabs>
+          <w:tab w:val="num" w:pos="720"/>
+        </w:tabs>
+        <w:ind w:left="720" w:hanging="360"/>
+      </w:pPr>
+    </w:lvl>
+    <w:lvl w:ilvl="1" w:tentative="1">
+      <w:start w:val="1"/>
+      <w:numFmt w:val="decimal"/>
+      <w:lvlText w:val="%2."/>
+      <w:lvlJc w:val="left"/>
+      <w:pPr>
+        <w:tabs>
+          <w:tab w:val="num" w:pos="1440"/>
+        </w:tabs>
+        <w:ind w:left="1440" w:hanging="360"/>
+      </w:pPr>
+    </w:lvl>
+    <w:lvl w:ilvl="2" w:tentative="1">
+      <w:start w:val="1"/>
+      <w:numFmt w:val="decimal"/>
+      <w:lvlText w:val="%3."/>
+      <w:lvlJc w:val="left"/>
+      <w:pPr>
+        <w:tabs>
+          <w:tab w:val="num" w:pos="2160"/>
+        </w:tabs>
+        <w:ind w:left="2160" w:hanging="360"/>
+      </w:pPr>
+    </w:lvl>
+    <w:lvl w:ilvl="3" w:tentative="1">
+      <w:start w:val="1"/>
+      <w:numFmt w:val="decimal"/>
+      <w:lvlText w:val="%4."/>
+      <w:lvlJc w:val="left"/>
+      <w:pPr>
+        <w:tabs>
+          <w:tab w:val="num" w:pos="2880"/>
+        </w:tabs>
+        <w:ind w:left="2880" w:hanging="360"/>
+      </w:pPr>
+    </w:lvl>
+    <w:lvl w:ilvl="4" w:tentative="1">
+      <w:start w:val="1"/>
+      <w:numFmt w:val="decimal"/>
+      <w:lvlText w:val="%5."/>
+      <w:lvlJc w:val="left"/>
+      <w:pPr>
+        <w:tabs>
+          <w:tab w:val="num" w:pos="3600"/>
+        </w:tabs>
+        <w:ind w:left="3600" w:hanging="360"/>
+      </w:pPr>
+    </w:lvl>
+    <w:lvl w:ilvl="5" w:tentative="1">
+      <w:start w:val="1"/>
+      <w:numFmt w:val="decimal"/>
+      <w:lvlText w:val="%6."/>
+      <w:lvlJc w:val="left"/>
+      <w:pPr>
+        <w:tabs>
+          <w:tab w:val="num" w:pos="4320"/>
+        </w:tabs>
+        <w:ind w:left="4320" w:hanging="360"/>
+      </w:pPr>
+    </w:lvl>
+    <w:lvl w:ilvl="6" w:tentative="1">
+      <w:start w:val="1"/>
+      <w:numFmt w:val="decimal"/>
+      <w:lvlText w:val="%7."/>
+      <w:lvlJc w:val="left"/>
+      <w:pPr>
+        <w:tabs>
+          <w:tab w:val="num" w:pos="5040"/>
+        </w:tabs>
+        <w:ind w:left="5040" w:hanging="360"/>
+      </w:pPr>
+    </w:lvl>
+    <w:lvl w:ilvl="7" w:tentative="1">
+      <w:start w:val="1"/>
+      <w:numFmt w:val="decimal"/>
+      <w:lvlText w:val="%8."/>
+      <w:lvlJc w:val="left"/>
+      <w:pPr>
+        <w:tabs>
+          <w:tab w:val="num" w:pos="5760"/>
+        </w:tabs>
+        <w:ind w:left="5760" w:hanging="360"/>
+      </w:pPr>
+    </w:lvl>
+    <w:lvl w:ilvl="8" w:tentative="1">
+      <w:start w:val="1"/>
+      <w:numFmt w:val="decimal"/>
+      <w:lvlText w:val="%9."/>
+      <w:lvlJc w:val="left"/>
+      <w:pPr>
+        <w:tabs>
+          <w:tab w:val="num" w:pos="6480"/>
+        </w:tabs>
+        <w:ind w:left="6480" w:hanging="360"/>
+      </w:pPr>
+    </w:lvl>
+  </w:abstractNum>
+  <w:abstractNum w:abstractNumId="7" w15:restartNumberingAfterBreak="0">
     <w:nsid w:val="3B892733"/>
     <w:multiLevelType w:val="multilevel"/>
     <w:tmpl w:val="10E43608"/>
@@ -5585,7 +8059,7 @@
       </w:pPr>
     </w:lvl>
   </w:abstractNum>
-  <w:abstractNum w:abstractNumId="5" w15:restartNumberingAfterBreak="0">
+  <w:abstractNum w:abstractNumId="8" w15:restartNumberingAfterBreak="0">
     <w:nsid w:val="412C79A8"/>
     <w:multiLevelType w:val="multilevel"/>
     <w:tmpl w:val="C61A76D2"/>
@@ -5698,7 +8172,7 @@
       </w:pPr>
     </w:lvl>
   </w:abstractNum>
-  <w:abstractNum w:abstractNumId="6" w15:restartNumberingAfterBreak="0">
+  <w:abstractNum w:abstractNumId="9" w15:restartNumberingAfterBreak="0">
     <w:nsid w:val="50DD795C"/>
     <w:multiLevelType w:val="multilevel"/>
     <w:tmpl w:val="2AB4A3EC"/>
@@ -5811,7 +8285,120 @@
       </w:pPr>
     </w:lvl>
   </w:abstractNum>
-  <w:abstractNum w:abstractNumId="7" w15:restartNumberingAfterBreak="0">
+  <w:abstractNum w:abstractNumId="10" w15:restartNumberingAfterBreak="0">
+    <w:nsid w:val="546B6144"/>
+    <w:multiLevelType w:val="multilevel"/>
+    <w:tmpl w:val="851A9E80"/>
+    <w:lvl w:ilvl="0">
+      <w:start w:val="1"/>
+      <w:numFmt w:val="decimal"/>
+      <w:lvlText w:val="%1."/>
+      <w:lvlJc w:val="left"/>
+      <w:pPr>
+        <w:tabs>
+          <w:tab w:val="num" w:pos="720"/>
+        </w:tabs>
+        <w:ind w:left="720" w:hanging="360"/>
+      </w:pPr>
+    </w:lvl>
+    <w:lvl w:ilvl="1" w:tentative="1">
+      <w:start w:val="1"/>
+      <w:numFmt w:val="decimal"/>
+      <w:lvlText w:val="%2."/>
+      <w:lvlJc w:val="left"/>
+      <w:pPr>
+        <w:tabs>
+          <w:tab w:val="num" w:pos="1440"/>
+        </w:tabs>
+        <w:ind w:left="1440" w:hanging="360"/>
+      </w:pPr>
+    </w:lvl>
+    <w:lvl w:ilvl="2" w:tentative="1">
+      <w:start w:val="1"/>
+      <w:numFmt w:val="decimal"/>
+      <w:lvlText w:val="%3."/>
+      <w:lvlJc w:val="left"/>
+      <w:pPr>
+        <w:tabs>
+          <w:tab w:val="num" w:pos="2160"/>
+        </w:tabs>
+        <w:ind w:left="2160" w:hanging="360"/>
+      </w:pPr>
+    </w:lvl>
+    <w:lvl w:ilvl="3" w:tentative="1">
+      <w:start w:val="1"/>
+      <w:numFmt w:val="decimal"/>
+      <w:lvlText w:val="%4."/>
+      <w:lvlJc w:val="left"/>
+      <w:pPr>
+        <w:tabs>
+          <w:tab w:val="num" w:pos="2880"/>
+        </w:tabs>
+        <w:ind w:left="2880" w:hanging="360"/>
+      </w:pPr>
+    </w:lvl>
+    <w:lvl w:ilvl="4" w:tentative="1">
+      <w:start w:val="1"/>
+      <w:numFmt w:val="decimal"/>
+      <w:lvlText w:val="%5."/>
+      <w:lvlJc w:val="left"/>
+      <w:pPr>
+        <w:tabs>
+          <w:tab w:val="num" w:pos="3600"/>
+        </w:tabs>
+        <w:ind w:left="3600" w:hanging="360"/>
+      </w:pPr>
+    </w:lvl>
+    <w:lvl w:ilvl="5" w:tentative="1">
+      <w:start w:val="1"/>
+      <w:numFmt w:val="decimal"/>
+      <w:lvlText w:val="%6."/>
+      <w:lvlJc w:val="left"/>
+      <w:pPr>
+        <w:tabs>
+          <w:tab w:val="num" w:pos="4320"/>
+        </w:tabs>
+        <w:ind w:left="4320" w:hanging="360"/>
+      </w:pPr>
+    </w:lvl>
+    <w:lvl w:ilvl="6" w:tentative="1">
+      <w:start w:val="1"/>
+      <w:numFmt w:val="decimal"/>
+      <w:lvlText w:val="%7."/>
+      <w:lvlJc w:val="left"/>
+      <w:pPr>
+        <w:tabs>
+          <w:tab w:val="num" w:pos="5040"/>
+        </w:tabs>
+        <w:ind w:left="5040" w:hanging="360"/>
+      </w:pPr>
+    </w:lvl>
+    <w:lvl w:ilvl="7" w:tentative="1">
+      <w:start w:val="1"/>
+      <w:numFmt w:val="decimal"/>
+      <w:lvlText w:val="%8."/>
+      <w:lvlJc w:val="left"/>
+      <w:pPr>
+        <w:tabs>
+          <w:tab w:val="num" w:pos="5760"/>
+        </w:tabs>
+        <w:ind w:left="5760" w:hanging="360"/>
+      </w:pPr>
+    </w:lvl>
+    <w:lvl w:ilvl="8" w:tentative="1">
+      <w:start w:val="1"/>
+      <w:numFmt w:val="decimal"/>
+      <w:lvlText w:val="%9."/>
+      <w:lvlJc w:val="left"/>
+      <w:pPr>
+        <w:tabs>
+          <w:tab w:val="num" w:pos="6480"/>
+        </w:tabs>
+        <w:ind w:left="6480" w:hanging="360"/>
+      </w:pPr>
+    </w:lvl>
+  </w:abstractNum>
+  <w:abstractNum w:abstractNumId="11" w15:restartNumberingAfterBreak="0">
     <w:nsid w:val="57911A2C"/>
     <w:multiLevelType w:val="multilevel"/>
     <w:tmpl w:val="9F167FC8"/>
@@ -5924,7 +8511,346 @@
       </w:pPr>
     </w:lvl>
   </w:abstractNum>
-  <w:abstractNum w:abstractNumId="8" w15:restartNumberingAfterBreak="0">
+  <w:abstractNum w:abstractNumId="12" w15:restartNumberingAfterBreak="0">
+    <w:nsid w:val="5C295932"/>
+    <w:multiLevelType w:val="multilevel"/>
+    <w:tmpl w:val="2C1C823E"/>
+    <w:lvl w:ilvl="0">
+      <w:start w:val="1"/>
+      <w:numFmt w:val="decimal"/>
+      <w:lvlText w:val="%1."/>
+      <w:lvlJc w:val="left"/>
+      <w:pPr>
+        <w:tabs>
+          <w:tab w:val="num" w:pos="720"/>
+        </w:tabs>
+        <w:ind w:left="720" w:hanging="360"/>
+      </w:pPr>
+    </w:lvl>
+    <w:lvl w:ilvl="1" w:tentative="1">
+      <w:start w:val="1"/>
+      <w:numFmt w:val="decimal"/>
+      <w:lvlText w:val="%2."/>
+      <w:lvlJc w:val="left"/>
+      <w:pPr>
+        <w:tabs>
+          <w:tab w:val="num" w:pos="1440"/>
+        </w:tabs>
+        <w:ind w:left="1440" w:hanging="360"/>
+      </w:pPr>
+    </w:lvl>
+    <w:lvl w:ilvl="2" w:tentative="1">
+      <w:start w:val="1"/>
+      <w:numFmt w:val="decimal"/>
+      <w:lvlText w:val="%3."/>
+      <w:lvlJc w:val="left"/>
+      <w:pPr>
+        <w:tabs>
+          <w:tab w:val="num" w:pos="2160"/>
+        </w:tabs>
+        <w:ind w:left="2160" w:hanging="360"/>
+      </w:pPr>
+    </w:lvl>
+    <w:lvl w:ilvl="3" w:tentative="1">
+      <w:start w:val="1"/>
+      <w:numFmt w:val="decimal"/>
+      <w:lvlText w:val="%4."/>
+      <w:lvlJc w:val="left"/>
+      <w:pPr>
+        <w:tabs>
+          <w:tab w:val="num" w:pos="2880"/>
+        </w:tabs>
+        <w:ind w:left="2880" w:hanging="360"/>
+      </w:pPr>
+    </w:lvl>
+    <w:lvl w:ilvl="4" w:tentative="1">
+      <w:start w:val="1"/>
+      <w:numFmt w:val="decimal"/>
+      <w:lvlText w:val="%5."/>
+      <w:lvlJc w:val="left"/>
+      <w:pPr>
+        <w:tabs>
+          <w:tab w:val="num" w:pos="3600"/>
+        </w:tabs>
+        <w:ind w:left="3600" w:hanging="360"/>
+      </w:pPr>
+    </w:lvl>
+    <w:lvl w:ilvl="5" w:tentative="1">
+      <w:start w:val="1"/>
+      <w:numFmt w:val="decimal"/>
+      <w:lvlText w:val="%6."/>
+      <w:lvlJc w:val="left"/>
+      <w:pPr>
+        <w:tabs>
+          <w:tab w:val="num" w:pos="4320"/>
+        </w:tabs>
+        <w:ind w:left="4320" w:hanging="360"/>
+      </w:pPr>
+    </w:lvl>
+    <w:lvl w:ilvl="6" w:tentative="1">
+      <w:start w:val="1"/>
+      <w:numFmt w:val="decimal"/>
+      <w:lvlText w:val="%7."/>
+      <w:lvlJc w:val="left"/>
+      <w:pPr>
+        <w:tabs>
+          <w:tab w:val="num" w:pos="5040"/>
+        </w:tabs>
+        <w:ind w:left="5040" w:hanging="360"/>
+      </w:pPr>
+    </w:lvl>
+    <w:lvl w:ilvl="7" w:tentative="1">
+      <w:start w:val="1"/>
+      <w:numFmt w:val="decimal"/>
+      <w:lvlText w:val="%8."/>
+      <w:lvlJc w:val="left"/>
+      <w:pPr>
+        <w:tabs>
+          <w:tab w:val="num" w:pos="5760"/>
+        </w:tabs>
+        <w:ind w:left="5760" w:hanging="360"/>
+      </w:pPr>
+    </w:lvl>
+    <w:lvl w:ilvl="8" w:tentative="1">
+      <w:start w:val="1"/>
+      <w:numFmt w:val="decimal"/>
+      <w:lvlText w:val="%9."/>
+      <w:lvlJc w:val="left"/>
+      <w:pPr>
+        <w:tabs>
+          <w:tab w:val="num" w:pos="6480"/>
+        </w:tabs>
+        <w:ind w:left="6480" w:hanging="360"/>
+      </w:pPr>
+    </w:lvl>
+  </w:abstractNum>
+  <w:abstractNum w:abstractNumId="13" w15:restartNumberingAfterBreak="0">
+    <w:nsid w:val="5C34739E"/>
+    <w:multiLevelType w:val="multilevel"/>
+    <w:tmpl w:val="8D28B6A8"/>
+    <w:lvl w:ilvl="0">
+      <w:start w:val="1"/>
+      <w:numFmt w:val="decimal"/>
+      <w:lvlText w:val="%1."/>
+      <w:lvlJc w:val="left"/>
+      <w:pPr>
+        <w:tabs>
+          <w:tab w:val="num" w:pos="720"/>
+        </w:tabs>
+        <w:ind w:left="720" w:hanging="360"/>
+      </w:pPr>
+    </w:lvl>
+    <w:lvl w:ilvl="1" w:tentative="1">
+      <w:start w:val="1"/>
+      <w:numFmt w:val="decimal"/>
+      <w:lvlText w:val="%2."/>
+      <w:lvlJc w:val="left"/>
+      <w:pPr>
+        <w:tabs>
+          <w:tab w:val="num" w:pos="1440"/>
+        </w:tabs>
+        <w:ind w:left="1440" w:hanging="360"/>
+      </w:pPr>
+    </w:lvl>
+    <w:lvl w:ilvl="2" w:tentative="1">
+      <w:start w:val="1"/>
+      <w:numFmt w:val="decimal"/>
+      <w:lvlText w:val="%3."/>
+      <w:lvlJc w:val="left"/>
+      <w:pPr>
+        <w:tabs>
+          <w:tab w:val="num" w:pos="2160"/>
+        </w:tabs>
+        <w:ind w:left="2160" w:hanging="360"/>
+      </w:pPr>
+    </w:lvl>
+    <w:lvl w:ilvl="3" w:tentative="1">
+      <w:start w:val="1"/>
+      <w:numFmt w:val="decimal"/>
+      <w:lvlText w:val="%4."/>
+      <w:lvlJc w:val="left"/>
+      <w:pPr>
+        <w:tabs>
+          <w:tab w:val="num" w:pos="2880"/>
+        </w:tabs>
+        <w:ind w:left="2880" w:hanging="360"/>
+      </w:pPr>
+    </w:lvl>
+    <w:lvl w:ilvl="4" w:tentative="1">
+      <w:start w:val="1"/>
+      <w:numFmt w:val="decimal"/>
+      <w:lvlText w:val="%5."/>
+      <w:lvlJc w:val="left"/>
+      <w:pPr>
+        <w:tabs>
+          <w:tab w:val="num" w:pos="3600"/>
+        </w:tabs>
+        <w:ind w:left="3600" w:hanging="360"/>
+      </w:pPr>
+    </w:lvl>
+    <w:lvl w:ilvl="5" w:tentative="1">
+      <w:start w:val="1"/>
+      <w:numFmt w:val="decimal"/>
+      <w:lvlText w:val="%6."/>
+      <w:lvlJc w:val="left"/>
+      <w:pPr>
+        <w:tabs>
+          <w:tab w:val="num" w:pos="4320"/>
+        </w:tabs>
+        <w:ind w:left="4320" w:hanging="360"/>
+      </w:pPr>
+    </w:lvl>
+    <w:lvl w:ilvl="6" w:tentative="1">
+      <w:start w:val="1"/>
+      <w:numFmt w:val="decimal"/>
+      <w:lvlText w:val="%7."/>
+      <w:lvlJc w:val="left"/>
+      <w:pPr>
+        <w:tabs>
+          <w:tab w:val="num" w:pos="5040"/>
+        </w:tabs>
+        <w:ind w:left="5040" w:hanging="360"/>
+      </w:pPr>
+    </w:lvl>
+    <w:lvl w:ilvl="7" w:tentative="1">
+      <w:start w:val="1"/>
+      <w:numFmt w:val="decimal"/>
+      <w:lvlText w:val="%8."/>
+      <w:lvlJc w:val="left"/>
+      <w:pPr>
+        <w:tabs>
+          <w:tab w:val="num" w:pos="5760"/>
+        </w:tabs>
+        <w:ind w:left="5760" w:hanging="360"/>
+      </w:pPr>
+    </w:lvl>
+    <w:lvl w:ilvl="8" w:tentative="1">
+      <w:start w:val="1"/>
+      <w:numFmt w:val="decimal"/>
+      <w:lvlText w:val="%9."/>
+      <w:lvlJc w:val="left"/>
+      <w:pPr>
+        <w:tabs>
+          <w:tab w:val="num" w:pos="6480"/>
+        </w:tabs>
+        <w:ind w:left="6480" w:hanging="360"/>
+      </w:pPr>
+    </w:lvl>
+  </w:abstractNum>
+  <w:abstractNum w:abstractNumId="14" w15:restartNumberingAfterBreak="0">
+    <w:nsid w:val="5CAF7002"/>
+    <w:multiLevelType w:val="multilevel"/>
+    <w:tmpl w:val="B0E8543C"/>
+    <w:lvl w:ilvl="0">
+      <w:start w:val="1"/>
+      <w:numFmt w:val="decimal"/>
+      <w:lvlText w:val="%1."/>
+      <w:lvlJc w:val="left"/>
+      <w:pPr>
+        <w:tabs>
+          <w:tab w:val="num" w:pos="720"/>
+        </w:tabs>
+        <w:ind w:left="720" w:hanging="360"/>
+      </w:pPr>
+    </w:lvl>
+    <w:lvl w:ilvl="1" w:tentative="1">
+      <w:start w:val="1"/>
+      <w:numFmt w:val="decimal"/>
+      <w:lvlText w:val="%2."/>
+      <w:lvlJc w:val="left"/>
+      <w:pPr>
+        <w:tabs>
+          <w:tab w:val="num" w:pos="1440"/>
+        </w:tabs>
+        <w:ind w:left="1440" w:hanging="360"/>
+      </w:pPr>
+    </w:lvl>
+    <w:lvl w:ilvl="2" w:tentative="1">
+      <w:start w:val="1"/>
+      <w:numFmt w:val="decimal"/>
+      <w:lvlText w:val="%3."/>
+      <w:lvlJc w:val="left"/>
+      <w:pPr>
+        <w:tabs>
+          <w:tab w:val="num" w:pos="2160"/>
+        </w:tabs>
+        <w:ind w:left="2160" w:hanging="360"/>
+      </w:pPr>
+    </w:lvl>
+    <w:lvl w:ilvl="3" w:tentative="1">
+      <w:start w:val="1"/>
+      <w:numFmt w:val="decimal"/>
+      <w:lvlText w:val="%4."/>
+      <w:lvlJc w:val="left"/>
+      <w:pPr>
+        <w:tabs>
+          <w:tab w:val="num" w:pos="2880"/>
+        </w:tabs>
+        <w:ind w:left="2880" w:hanging="360"/>
+      </w:pPr>
+    </w:lvl>
+    <w:lvl w:ilvl="4" w:tentative="1">
+      <w:start w:val="1"/>
+      <w:numFmt w:val="decimal"/>
+      <w:lvlText w:val="%5."/>
+      <w:lvlJc w:val="left"/>
+      <w:pPr>
+        <w:tabs>
+          <w:tab w:val="num" w:pos="3600"/>
+        </w:tabs>
+        <w:ind w:left="3600" w:hanging="360"/>
+      </w:pPr>
+    </w:lvl>
+    <w:lvl w:ilvl="5" w:tentative="1">
+      <w:start w:val="1"/>
+      <w:numFmt w:val="decimal"/>
+      <w:lvlText w:val="%6."/>
+      <w:lvlJc w:val="left"/>
+      <w:pPr>
+        <w:tabs>
+          <w:tab w:val="num" w:pos="4320"/>
+        </w:tabs>
+        <w:ind w:left="4320" w:hanging="360"/>
+      </w:pPr>
+    </w:lvl>
+    <w:lvl w:ilvl="6" w:tentative="1">
+      <w:start w:val="1"/>
+      <w:numFmt w:val="decimal"/>
+      <w:lvlText w:val="%7."/>
+      <w:lvlJc w:val="left"/>
+      <w:pPr>
+        <w:tabs>
+          <w:tab w:val="num" w:pos="5040"/>
+        </w:tabs>
+        <w:ind w:left="5040" w:hanging="360"/>
+      </w:pPr>
+    </w:lvl>
+    <w:lvl w:ilvl="7" w:tentative="1">
+      <w:start w:val="1"/>
+      <w:numFmt w:val="decimal"/>
+      <w:lvlText w:val="%8."/>
+      <w:lvlJc w:val="left"/>
+      <w:pPr>
+        <w:tabs>
+          <w:tab w:val="num" w:pos="5760"/>
+        </w:tabs>
+        <w:ind w:left="5760" w:hanging="360"/>
+      </w:pPr>
+    </w:lvl>
+    <w:lvl w:ilvl="8" w:tentative="1">
+      <w:start w:val="1"/>
+      <w:numFmt w:val="decimal"/>
+      <w:lvlText w:val="%9."/>
+      <w:lvlJc w:val="left"/>
+      <w:pPr>
+        <w:tabs>
+          <w:tab w:val="num" w:pos="6480"/>
+        </w:tabs>
+        <w:ind w:left="6480" w:hanging="360"/>
+      </w:pPr>
+    </w:lvl>
+  </w:abstractNum>
+  <w:abstractNum w:abstractNumId="15" w15:restartNumberingAfterBreak="0">
     <w:nsid w:val="7122051B"/>
     <w:multiLevelType w:val="multilevel"/>
     <w:tmpl w:val="D77C6FD2"/>
@@ -6068,7 +8994,7 @@
       </w:rPr>
     </w:lvl>
   </w:abstractNum>
-  <w:abstractNum w:abstractNumId="9" w15:restartNumberingAfterBreak="0">
+  <w:abstractNum w:abstractNumId="16" w15:restartNumberingAfterBreak="0">
     <w:nsid w:val="73277A9E"/>
     <w:multiLevelType w:val="multilevel"/>
     <w:tmpl w:val="A414445C"/>
@@ -6181,7 +9107,7 @@
       </w:pPr>
     </w:lvl>
   </w:abstractNum>
-  <w:abstractNum w:abstractNumId="10" w15:restartNumberingAfterBreak="0">
+  <w:abstractNum w:abstractNumId="17" w15:restartNumberingAfterBreak="0">
     <w:nsid w:val="7627100C"/>
     <w:multiLevelType w:val="multilevel"/>
     <w:tmpl w:val="7C927AFC"/>
@@ -6294,23 +9220,136 @@
       </w:pPr>
     </w:lvl>
   </w:abstractNum>
+  <w:abstractNum w:abstractNumId="18" w15:restartNumberingAfterBreak="0">
+    <w:nsid w:val="76DB0486"/>
+    <w:multiLevelType w:val="multilevel"/>
+    <w:tmpl w:val="8EAA81A8"/>
+    <w:lvl w:ilvl="0">
+      <w:start w:val="1"/>
+      <w:numFmt w:val="decimal"/>
+      <w:lvlText w:val="%1."/>
+      <w:lvlJc w:val="left"/>
+      <w:pPr>
+        <w:tabs>
+          <w:tab w:val="num" w:pos="720"/>
+        </w:tabs>
+        <w:ind w:left="720" w:hanging="360"/>
+      </w:pPr>
+    </w:lvl>
+    <w:lvl w:ilvl="1" w:tentative="1">
+      <w:start w:val="1"/>
+      <w:numFmt w:val="decimal"/>
+      <w:lvlText w:val="%2."/>
+      <w:lvlJc w:val="left"/>
+      <w:pPr>
+        <w:tabs>
+          <w:tab w:val="num" w:pos="1440"/>
+        </w:tabs>
+        <w:ind w:left="1440" w:hanging="360"/>
+      </w:pPr>
+    </w:lvl>
+    <w:lvl w:ilvl="2" w:tentative="1">
+      <w:start w:val="1"/>
+      <w:numFmt w:val="decimal"/>
+      <w:lvlText w:val="%3."/>
+      <w:lvlJc w:val="left"/>
+      <w:pPr>
+        <w:tabs>
+          <w:tab w:val="num" w:pos="2160"/>
+        </w:tabs>
+        <w:ind w:left="2160" w:hanging="360"/>
+      </w:pPr>
+    </w:lvl>
+    <w:lvl w:ilvl="3" w:tentative="1">
+      <w:start w:val="1"/>
+      <w:numFmt w:val="decimal"/>
+      <w:lvlText w:val="%4."/>
+      <w:lvlJc w:val="left"/>
+      <w:pPr>
+        <w:tabs>
+          <w:tab w:val="num" w:pos="2880"/>
+        </w:tabs>
+        <w:ind w:left="2880" w:hanging="360"/>
+      </w:pPr>
+    </w:lvl>
+    <w:lvl w:ilvl="4" w:tentative="1">
+      <w:start w:val="1"/>
+      <w:numFmt w:val="decimal"/>
+      <w:lvlText w:val="%5."/>
+      <w:lvlJc w:val="left"/>
+      <w:pPr>
+        <w:tabs>
+          <w:tab w:val="num" w:pos="3600"/>
+        </w:tabs>
+        <w:ind w:left="3600" w:hanging="360"/>
+      </w:pPr>
+    </w:lvl>
+    <w:lvl w:ilvl="5" w:tentative="1">
+      <w:start w:val="1"/>
+      <w:numFmt w:val="decimal"/>
+      <w:lvlText w:val="%6."/>
+      <w:lvlJc w:val="left"/>
+      <w:pPr>
+        <w:tabs>
+          <w:tab w:val="num" w:pos="4320"/>
+        </w:tabs>
+        <w:ind w:left="4320" w:hanging="360"/>
+      </w:pPr>
+    </w:lvl>
+    <w:lvl w:ilvl="6" w:tentative="1">
+      <w:start w:val="1"/>
+      <w:numFmt w:val="decimal"/>
+      <w:lvlText w:val="%7."/>
+      <w:lvlJc w:val="left"/>
+      <w:pPr>
+        <w:tabs>
+          <w:tab w:val="num" w:pos="5040"/>
+        </w:tabs>
+        <w:ind w:left="5040" w:hanging="360"/>
+      </w:pPr>
+    </w:lvl>
+    <w:lvl w:ilvl="7" w:tentative="1">
+      <w:start w:val="1"/>
+      <w:numFmt w:val="decimal"/>
+      <w:lvlText w:val="%8."/>
+      <w:lvlJc w:val="left"/>
+      <w:pPr>
+        <w:tabs>
+          <w:tab w:val="num" w:pos="5760"/>
+        </w:tabs>
+        <w:ind w:left="5760" w:hanging="360"/>
+      </w:pPr>
+    </w:lvl>
+    <w:lvl w:ilvl="8" w:tentative="1">
+      <w:start w:val="1"/>
+      <w:numFmt w:val="decimal"/>
+      <w:lvlText w:val="%9."/>
+      <w:lvlJc w:val="left"/>
+      <w:pPr>
+        <w:tabs>
+          <w:tab w:val="num" w:pos="6480"/>
+        </w:tabs>
+        <w:ind w:left="6480" w:hanging="360"/>
+      </w:pPr>
+    </w:lvl>
+  </w:abstractNum>
   <w:num w:numId="1" w16cid:durableId="120734747">
-    <w:abstractNumId w:val="8"/>
+    <w:abstractNumId w:val="15"/>
   </w:num>
   <w:num w:numId="2" w16cid:durableId="728385184">
-    <w:abstractNumId w:val="2"/>
+    <w:abstractNumId w:val="4"/>
   </w:num>
   <w:num w:numId="3" w16cid:durableId="885532725">
-    <w:abstractNumId w:val="3"/>
+    <w:abstractNumId w:val="5"/>
   </w:num>
   <w:num w:numId="4" w16cid:durableId="163129789">
-    <w:abstractNumId w:val="6"/>
+    <w:abstractNumId w:val="9"/>
   </w:num>
   <w:num w:numId="5" w16cid:durableId="2121760230">
-    <w:abstractNumId w:val="9"/>
+    <w:abstractNumId w:val="16"/>
   </w:num>
   <w:num w:numId="6" w16cid:durableId="1889224418">
-    <w:abstractNumId w:val="5"/>
+    <w:abstractNumId w:val="8"/>
   </w:num>
   <w:num w:numId="7" w16cid:durableId="1819804998">
     <w:abstractNumId w:val="0"/>
@@ -6319,13 +9358,37 @@
     <w:abstractNumId w:val="1"/>
   </w:num>
   <w:num w:numId="9" w16cid:durableId="1336803465">
+    <w:abstractNumId w:val="11"/>
+  </w:num>
+  <w:num w:numId="10" w16cid:durableId="485362230">
     <w:abstractNumId w:val="7"/>
   </w:num>
-  <w:num w:numId="10" w16cid:durableId="485362230">
-    <w:abstractNumId w:val="4"/>
+  <w:num w:numId="11" w16cid:durableId="1364943427">
+    <w:abstractNumId w:val="17"/>
   </w:num>
-  <w:num w:numId="11" w16cid:durableId="1364943427">
+  <w:num w:numId="12" w16cid:durableId="1564877419">
+    <w:abstractNumId w:val="13"/>
+  </w:num>
+  <w:num w:numId="13" w16cid:durableId="425003557">
+    <w:abstractNumId w:val="6"/>
+  </w:num>
+  <w:num w:numId="14" w16cid:durableId="1898322198">
+    <w:abstractNumId w:val="14"/>
+  </w:num>
+  <w:num w:numId="15" w16cid:durableId="477190077">
+    <w:abstractNumId w:val="3"/>
+  </w:num>
+  <w:num w:numId="16" w16cid:durableId="510877313">
+    <w:abstractNumId w:val="2"/>
+  </w:num>
+  <w:num w:numId="17" w16cid:durableId="541406820">
     <w:abstractNumId w:val="10"/>
+  </w:num>
+  <w:num w:numId="18" w16cid:durableId="1975678283">
+    <w:abstractNumId w:val="12"/>
+  </w:num>
+  <w:num w:numId="19" w16cid:durableId="1211307066">
+    <w:abstractNumId w:val="18"/>
   </w:num>
 </w:numbering>
 </file>

</xml_diff>